<commit_message>
final testing for April 26
</commit_message>
<xml_diff>
--- a/TourneyVersion/Tourney Excel App User Manual.docx
+++ b/TourneyVersion/Tourney Excel App User Manual.docx
@@ -1067,7 +1067,25 @@
         </w:numPr>
       </w:pPr>
       <w:r>
-        <w:t>Use Ctrl-C/Ctrl-V to copy all Entries tab input to Registration Entries tab.</w:t>
+        <w:t>Use Ctrl-A on Prelim to select all relevant entry fields.</w:t>
+      </w:r>
+    </w:p>
+    <w:p>
+      <w:pPr>
+        <w:pStyle w:val="ListParagraph"/>
+        <w:numPr>
+          <w:ilvl w:val="1"/>
+          <w:numId w:val="5"/>
+        </w:numPr>
+      </w:pPr>
+      <w:r>
+        <w:t>Use Ctrl-C/Ctrl-V to copy all Entries tab input</w:t>
+      </w:r>
+      <w:r>
+        <w:t xml:space="preserve"> from Prelim</w:t>
+      </w:r>
+      <w:r>
+        <w:t xml:space="preserve"> to Registration Entries tab.</w:t>
       </w:r>
     </w:p>
     <w:p>
@@ -1081,6 +1099,21 @@
       <w:r>
         <w:t>Copy everything including Veggies column; formulas copy over too.</w:t>
       </w:r>
+      <w:r>
+        <w:t xml:space="preserve"> </w:t>
+      </w:r>
+    </w:p>
+    <w:p>
+      <w:pPr>
+        <w:pStyle w:val="ListParagraph"/>
+        <w:numPr>
+          <w:ilvl w:val="1"/>
+          <w:numId w:val="5"/>
+        </w:numPr>
+      </w:pPr>
+      <w:r>
+        <w:t>Veggies column requires a separate copy of the column from prelim to registration.</w:t>
+      </w:r>
     </w:p>
     <w:p>
       <w:pPr>
@@ -1103,6 +1136,18 @@
         </w:numPr>
       </w:pPr>
       <w:r>
+        <w:t>Set up the consy parameters and pools at this time.</w:t>
+      </w:r>
+    </w:p>
+    <w:p>
+      <w:pPr>
+        <w:pStyle w:val="ListParagraph"/>
+        <w:numPr>
+          <w:ilvl w:val="1"/>
+          <w:numId w:val="5"/>
+        </w:numPr>
+      </w:pPr>
+      <w:r>
         <w:t>Confirm Tourney, MainSetup, and ConsySetup tab input for accuracy and completeness.</w:t>
       </w:r>
     </w:p>
@@ -1115,6 +1160,18 @@
         </w:numPr>
       </w:pPr>
       <w:r>
+        <w:t xml:space="preserve">After setting up Tourney Info use Save Tourney Info button to propagate tourney info </w:t>
+      </w:r>
+    </w:p>
+    <w:p>
+      <w:pPr>
+        <w:pStyle w:val="ListParagraph"/>
+        <w:numPr>
+          <w:ilvl w:val="1"/>
+          <w:numId w:val="5"/>
+        </w:numPr>
+      </w:pPr>
+      <w:r>
         <w:t>Use Entries tab Validate Registration</w:t>
       </w:r>
       <w:r>
@@ -1160,7 +1217,10 @@
         <w:t xml:space="preserve">Use Registration Entries </w:t>
       </w:r>
       <w:r>
-        <w:t>Plain &amp; Pool Player Labels to create labels.</w:t>
+        <w:t>Plain &amp; Pool Player Labels to create labels</w:t>
+      </w:r>
+      <w:r>
+        <w:t xml:space="preserve"> the night before.</w:t>
       </w:r>
     </w:p>
     <w:p>
@@ -1238,6 +1298,42 @@
         </w:numPr>
       </w:pPr>
       <w:r>
+        <w:t>Use Open Workbooks to get all the required workbooks opened up ready to go.</w:t>
+      </w:r>
+    </w:p>
+    <w:p>
+      <w:pPr>
+        <w:pStyle w:val="ListParagraph"/>
+        <w:numPr>
+          <w:ilvl w:val="1"/>
+          <w:numId w:val="5"/>
+        </w:numPr>
+      </w:pPr>
+      <w:r>
+        <w:t>This final validation on the MainRoster sets the payout pools.</w:t>
+      </w:r>
+    </w:p>
+    <w:p>
+      <w:pPr>
+        <w:pStyle w:val="ListParagraph"/>
+        <w:numPr>
+          <w:ilvl w:val="1"/>
+          <w:numId w:val="5"/>
+        </w:numPr>
+      </w:pPr>
+      <w:r>
+        <w:t>Use Copy Main Roster Numbers to get MainRoster number for MainFinancials calculations</w:t>
+      </w:r>
+    </w:p>
+    <w:p>
+      <w:pPr>
+        <w:pStyle w:val="ListParagraph"/>
+        <w:numPr>
+          <w:ilvl w:val="1"/>
+          <w:numId w:val="5"/>
+        </w:numPr>
+      </w:pPr>
+      <w:r>
         <w:t>Check MainFinancials and validate all expenses are in.</w:t>
       </w:r>
     </w:p>
@@ -1262,6 +1358,18 @@
         </w:numPr>
       </w:pPr>
       <w:r>
+        <w:t>Grad pools tables found on MainPools; pool1 is EQ pool so cannot yet be caluclated</w:t>
+      </w:r>
+    </w:p>
+    <w:p>
+      <w:pPr>
+        <w:pStyle w:val="ListParagraph"/>
+        <w:numPr>
+          <w:ilvl w:val="1"/>
+          <w:numId w:val="5"/>
+        </w:numPr>
+      </w:pPr>
+      <w:r>
         <w:t>Use FinalizeForNoShows on MainRoster Entries tab to create all payoff brackets and tabs.</w:t>
       </w:r>
     </w:p>
@@ -1310,6 +1418,7 @@
         </w:numPr>
       </w:pPr>
       <w:r>
+        <w:lastRenderedPageBreak/>
         <w:t>Enter the game card results into MainRoster Results tab and sort</w:t>
       </w:r>
       <w:r>
@@ -1325,6 +1434,30 @@
         </w:numPr>
       </w:pPr>
       <w:r>
+        <w:t>You must have entered the results before MainPools can be computed and MainSidePool.xlsm must already be open.</w:t>
+      </w:r>
+    </w:p>
+    <w:p>
+      <w:pPr>
+        <w:pStyle w:val="ListParagraph"/>
+        <w:numPr>
+          <w:ilvl w:val="1"/>
+          <w:numId w:val="5"/>
+        </w:numPr>
+      </w:pPr>
+      <w:r>
+        <w:t>ON MainRoster:Results, after Sort Main Results, Finalize Pools will put all the names into all the pools</w:t>
+      </w:r>
+    </w:p>
+    <w:p>
+      <w:pPr>
+        <w:pStyle w:val="ListParagraph"/>
+        <w:numPr>
+          <w:ilvl w:val="1"/>
+          <w:numId w:val="5"/>
+        </w:numPr>
+      </w:pPr>
+      <w:r>
         <w:t>Pool1 (EQ) tab will now have names of EQ payouts.</w:t>
       </w:r>
     </w:p>
@@ -1418,7 +1551,6 @@
         </w:numPr>
       </w:pPr>
       <w:r>
-        <w:lastRenderedPageBreak/>
         <w:t>Manually mark Consy Tourney cards with pools entered.</w:t>
       </w:r>
     </w:p>
@@ -1458,10 +1590,34 @@
         <w:t>Follow from 3.</w:t>
       </w:r>
       <w:r>
-        <w:t>5</w:t>
+        <w:t>9</w:t>
       </w:r>
       <w:r>
         <w:t xml:space="preserve"> above but using Consy-specific workbooks and tabs.</w:t>
+      </w:r>
+    </w:p>
+    <w:p>
+      <w:pPr>
+        <w:pStyle w:val="ListParagraph"/>
+        <w:numPr>
+          <w:ilvl w:val="1"/>
+          <w:numId w:val="5"/>
+        </w:numPr>
+      </w:pPr>
+      <w:r>
+        <w:t xml:space="preserve">After recording all Entered on Consy:Entries sheet, Finalize Consy Entrants will create the Consy payoff schedule and the Consy Side Pools. </w:t>
+      </w:r>
+    </w:p>
+    <w:p>
+      <w:pPr>
+        <w:pStyle w:val="ListParagraph"/>
+        <w:numPr>
+          <w:ilvl w:val="1"/>
+          <w:numId w:val="5"/>
+        </w:numPr>
+      </w:pPr>
+      <w:r>
+        <w:t>Any Consy financial have to be recorded and Finalized before doing this computataion.</w:t>
       </w:r>
     </w:p>
     <w:p/>

</xml_diff>

<commit_message>
2026 testing changes to consyroster clearmergedrange
</commit_message>
<xml_diff>
--- a/TourneyVersion/Tourney Excel App User Manual.docx
+++ b/TourneyVersion/Tourney Excel App User Manual.docx
@@ -40,20 +40,40 @@
           <w:numId w:val="4"/>
         </w:numPr>
       </w:pPr>
+      <w:proofErr w:type="spellStart"/>
+      <w:proofErr w:type="gramStart"/>
       <w:r>
         <w:t>PreliminaryRegistration</w:t>
       </w:r>
-    </w:p>
-    <w:p>
-      <w:pPr>
-        <w:pStyle w:val="ListParagraph"/>
-        <w:numPr>
-          <w:ilvl w:val="1"/>
-          <w:numId w:val="4"/>
-        </w:numPr>
-      </w:pPr>
-      <w:r>
-        <w:t>A stand-alone workbook used to gather registrations ahead of the tourney.</w:t>
+      <w:proofErr w:type="spellEnd"/>
+      <w:proofErr w:type="gramEnd"/>
+    </w:p>
+    <w:p>
+      <w:pPr>
+        <w:pStyle w:val="ListParagraph"/>
+        <w:numPr>
+          <w:ilvl w:val="1"/>
+          <w:numId w:val="4"/>
+        </w:numPr>
+      </w:pPr>
+      <w:r>
+        <w:t xml:space="preserve">A stand-alone workbook </w:t>
+      </w:r>
+      <w:proofErr w:type="gramStart"/>
+      <w:r>
+        <w:t>used</w:t>
+      </w:r>
+      <w:proofErr w:type="gramEnd"/>
+      <w:r>
+        <w:t xml:space="preserve"> to gather registrations ahead of the </w:t>
+      </w:r>
+      <w:proofErr w:type="gramStart"/>
+      <w:r>
+        <w:t>tourney</w:t>
+      </w:r>
+      <w:proofErr w:type="gramEnd"/>
+      <w:r>
+        <w:t>.</w:t>
       </w:r>
     </w:p>
     <w:p>
@@ -89,7 +109,15 @@
         </w:numPr>
       </w:pPr>
       <w:r>
-        <w:t>Main Setup tab for Main pools types, fees.</w:t>
+        <w:t xml:space="preserve">Main Setup tab for Main </w:t>
+      </w:r>
+      <w:proofErr w:type="gramStart"/>
+      <w:r>
+        <w:t>pools</w:t>
+      </w:r>
+      <w:proofErr w:type="gramEnd"/>
+      <w:r>
+        <w:t xml:space="preserve"> types, fees.</w:t>
       </w:r>
     </w:p>
     <w:p>
@@ -113,19 +141,43 @@
         </w:numPr>
       </w:pPr>
       <w:r>
-        <w:t>Can gather new players and update existing players info.</w:t>
-      </w:r>
-    </w:p>
-    <w:p>
-      <w:pPr>
-        <w:pStyle w:val="ListParagraph"/>
-        <w:numPr>
-          <w:ilvl w:val="1"/>
-          <w:numId w:val="4"/>
-        </w:numPr>
-      </w:pPr>
-      <w:r>
-        <w:t>Set up particulars of the tourney; fees, pools, name, dates, &amp; etc.</w:t>
+        <w:t xml:space="preserve">Can gather new players and update existing </w:t>
+      </w:r>
+      <w:proofErr w:type="gramStart"/>
+      <w:r>
+        <w:t>players</w:t>
+      </w:r>
+      <w:proofErr w:type="gramEnd"/>
+      <w:r>
+        <w:t xml:space="preserve"> info.</w:t>
+      </w:r>
+    </w:p>
+    <w:p>
+      <w:pPr>
+        <w:pStyle w:val="ListParagraph"/>
+        <w:numPr>
+          <w:ilvl w:val="1"/>
+          <w:numId w:val="4"/>
+        </w:numPr>
+      </w:pPr>
+      <w:r>
+        <w:t xml:space="preserve">Set up particulars of the </w:t>
+      </w:r>
+      <w:proofErr w:type="gramStart"/>
+      <w:r>
+        <w:t>tourney;</w:t>
+      </w:r>
+      <w:proofErr w:type="gramEnd"/>
+      <w:r>
+        <w:t xml:space="preserve"> fees, pools, name, </w:t>
+      </w:r>
+      <w:proofErr w:type="gramStart"/>
+      <w:r>
+        <w:t>dates, &amp;</w:t>
+      </w:r>
+      <w:proofErr w:type="gramEnd"/>
+      <w:r>
+        <w:t xml:space="preserve"> etc.</w:t>
       </w:r>
     </w:p>
     <w:p>
@@ -149,7 +201,15 @@
         </w:numPr>
       </w:pPr>
       <w:r>
-        <w:t>Entries tab copied here from PreliminaryRegistration.</w:t>
+        <w:t xml:space="preserve">Entries tab copied here from </w:t>
+      </w:r>
+      <w:proofErr w:type="spellStart"/>
+      <w:r>
+        <w:t>PreliminaryRegistration</w:t>
+      </w:r>
+      <w:proofErr w:type="spellEnd"/>
+      <w:r>
+        <w:t>.</w:t>
       </w:r>
     </w:p>
     <w:p>
@@ -196,20 +256,41 @@
           <w:numId w:val="4"/>
         </w:numPr>
       </w:pPr>
-      <w:r>
-        <w:t>Consy Setup tab for Consy pools, types, fees.</w:t>
-      </w:r>
-    </w:p>
-    <w:p>
-      <w:pPr>
-        <w:pStyle w:val="ListParagraph"/>
-        <w:numPr>
-          <w:ilvl w:val="1"/>
-          <w:numId w:val="4"/>
-        </w:numPr>
-      </w:pPr>
-      <w:r>
-        <w:t>Plain &amp; Pool Player Labels creates labels in LabelList workbook.</w:t>
+      <w:proofErr w:type="spellStart"/>
+      <w:r>
+        <w:t>Consy</w:t>
+      </w:r>
+      <w:proofErr w:type="spellEnd"/>
+      <w:r>
+        <w:t xml:space="preserve"> Setup tab for </w:t>
+      </w:r>
+      <w:proofErr w:type="spellStart"/>
+      <w:r>
+        <w:t>Consy</w:t>
+      </w:r>
+      <w:proofErr w:type="spellEnd"/>
+      <w:r>
+        <w:t xml:space="preserve"> pools, types, fees.</w:t>
+      </w:r>
+    </w:p>
+    <w:p>
+      <w:pPr>
+        <w:pStyle w:val="ListParagraph"/>
+        <w:numPr>
+          <w:ilvl w:val="1"/>
+          <w:numId w:val="4"/>
+        </w:numPr>
+      </w:pPr>
+      <w:r>
+        <w:t xml:space="preserve">Plain &amp; Pool Player Labels creates labels in </w:t>
+      </w:r>
+      <w:proofErr w:type="spellStart"/>
+      <w:r>
+        <w:t>LabelList</w:t>
+      </w:r>
+      <w:proofErr w:type="spellEnd"/>
+      <w:r>
+        <w:t xml:space="preserve"> workbook.</w:t>
       </w:r>
     </w:p>
     <w:p>
@@ -259,44 +340,77 @@
           <w:numId w:val="4"/>
         </w:numPr>
       </w:pPr>
+      <w:proofErr w:type="spellStart"/>
       <w:r>
         <w:t>LabelList</w:t>
       </w:r>
-    </w:p>
-    <w:p>
-      <w:pPr>
-        <w:pStyle w:val="ListParagraph"/>
-        <w:numPr>
-          <w:ilvl w:val="1"/>
-          <w:numId w:val="4"/>
-        </w:numPr>
-      </w:pPr>
-      <w:r>
-        <w:t>Requires entrants be moved to MainRoster</w:t>
-      </w:r>
-    </w:p>
-    <w:p>
-      <w:pPr>
-        <w:pStyle w:val="ListParagraph"/>
-        <w:numPr>
-          <w:ilvl w:val="1"/>
-          <w:numId w:val="4"/>
-        </w:numPr>
-      </w:pPr>
-      <w:r>
-        <w:t>PoolLabels has a label with pools entered for all in MainRoster.</w:t>
-      </w:r>
-    </w:p>
-    <w:p>
-      <w:pPr>
-        <w:pStyle w:val="ListParagraph"/>
-        <w:numPr>
-          <w:ilvl w:val="1"/>
-          <w:numId w:val="4"/>
-        </w:numPr>
-      </w:pPr>
-      <w:r>
-        <w:t>PlainLabels has a label without pools, for use on Consy cards.</w:t>
+      <w:proofErr w:type="spellEnd"/>
+    </w:p>
+    <w:p>
+      <w:pPr>
+        <w:pStyle w:val="ListParagraph"/>
+        <w:numPr>
+          <w:ilvl w:val="1"/>
+          <w:numId w:val="4"/>
+        </w:numPr>
+      </w:pPr>
+      <w:r>
+        <w:t xml:space="preserve">Requires entrants be moved to </w:t>
+      </w:r>
+      <w:proofErr w:type="spellStart"/>
+      <w:r>
+        <w:t>MainRoster</w:t>
+      </w:r>
+      <w:proofErr w:type="spellEnd"/>
+    </w:p>
+    <w:p>
+      <w:pPr>
+        <w:pStyle w:val="ListParagraph"/>
+        <w:numPr>
+          <w:ilvl w:val="1"/>
+          <w:numId w:val="4"/>
+        </w:numPr>
+      </w:pPr>
+      <w:proofErr w:type="spellStart"/>
+      <w:r>
+        <w:t>PoolLabels</w:t>
+      </w:r>
+      <w:proofErr w:type="spellEnd"/>
+      <w:r>
+        <w:t xml:space="preserve"> has a label with pools entered for all in </w:t>
+      </w:r>
+      <w:proofErr w:type="spellStart"/>
+      <w:r>
+        <w:t>MainRoster</w:t>
+      </w:r>
+      <w:proofErr w:type="spellEnd"/>
+      <w:r>
+        <w:t>.</w:t>
+      </w:r>
+    </w:p>
+    <w:p>
+      <w:pPr>
+        <w:pStyle w:val="ListParagraph"/>
+        <w:numPr>
+          <w:ilvl w:val="1"/>
+          <w:numId w:val="4"/>
+        </w:numPr>
+      </w:pPr>
+      <w:proofErr w:type="spellStart"/>
+      <w:r>
+        <w:t>PlainLabels</w:t>
+      </w:r>
+      <w:proofErr w:type="spellEnd"/>
+      <w:r>
+        <w:t xml:space="preserve"> has a label without pools, for use on </w:t>
+      </w:r>
+      <w:proofErr w:type="spellStart"/>
+      <w:r>
+        <w:t>Consy</w:t>
+      </w:r>
+      <w:proofErr w:type="spellEnd"/>
+      <w:r>
+        <w:t xml:space="preserve"> cards.</w:t>
       </w:r>
     </w:p>
     <w:p>
@@ -319,9 +433,11 @@
           <w:numId w:val="4"/>
         </w:numPr>
       </w:pPr>
+      <w:proofErr w:type="spellStart"/>
       <w:r>
         <w:t>MainRoster</w:t>
       </w:r>
+      <w:proofErr w:type="spellEnd"/>
     </w:p>
     <w:p>
       <w:pPr>
@@ -380,19 +496,43 @@
         </w:numPr>
       </w:pPr>
       <w:r>
-        <w:t>Pool2, poo3, pool4 tabs are usually grad pools.</w:t>
-      </w:r>
-    </w:p>
-    <w:p>
-      <w:pPr>
-        <w:pStyle w:val="ListParagraph"/>
-        <w:numPr>
-          <w:ilvl w:val="1"/>
-          <w:numId w:val="4"/>
-        </w:numPr>
-      </w:pPr>
-      <w:r>
-        <w:t>After end of play, those that qualify are marked in Q</w:t>
+        <w:t>Pool2, poo3</w:t>
+      </w:r>
+      <w:proofErr w:type="gramStart"/>
+      <w:r>
+        <w:t>, pool4</w:t>
+      </w:r>
+      <w:proofErr w:type="gramEnd"/>
+      <w:r>
+        <w:t xml:space="preserve"> tabs are usually grad pools.</w:t>
+      </w:r>
+    </w:p>
+    <w:p>
+      <w:pPr>
+        <w:pStyle w:val="ListParagraph"/>
+        <w:numPr>
+          <w:ilvl w:val="1"/>
+          <w:numId w:val="4"/>
+        </w:numPr>
+      </w:pPr>
+      <w:r>
+        <w:t xml:space="preserve">After </w:t>
+      </w:r>
+      <w:proofErr w:type="gramStart"/>
+      <w:r>
+        <w:t>end of</w:t>
+      </w:r>
+      <w:proofErr w:type="gramEnd"/>
+      <w:r>
+        <w:t xml:space="preserve"> </w:t>
+      </w:r>
+      <w:proofErr w:type="gramStart"/>
+      <w:r>
+        <w:t>play</w:t>
+      </w:r>
+      <w:proofErr w:type="gramEnd"/>
+      <w:r>
+        <w:t>, those that qualify are marked in Q</w:t>
       </w:r>
       <w:r>
         <w:t>ualifie</w:t>
@@ -457,32 +597,52 @@
           <w:numId w:val="4"/>
         </w:numPr>
       </w:pPr>
+      <w:proofErr w:type="spellStart"/>
       <w:r>
         <w:t>MainFinancials</w:t>
       </w:r>
-    </w:p>
-    <w:p>
-      <w:pPr>
-        <w:pStyle w:val="ListParagraph"/>
-        <w:numPr>
-          <w:ilvl w:val="1"/>
-          <w:numId w:val="4"/>
-        </w:numPr>
-      </w:pPr>
-      <w:r>
-        <w:t>MainSummary tab show overview of main tourney finances.</w:t>
-      </w:r>
-    </w:p>
-    <w:p>
-      <w:pPr>
-        <w:pStyle w:val="ListParagraph"/>
-        <w:numPr>
-          <w:ilvl w:val="1"/>
-          <w:numId w:val="4"/>
-        </w:numPr>
-      </w:pPr>
-      <w:r>
-        <w:t>PlayerBenefits tab captures costs for trophies, meals, drinks.</w:t>
+      <w:proofErr w:type="spellEnd"/>
+    </w:p>
+    <w:p>
+      <w:pPr>
+        <w:pStyle w:val="ListParagraph"/>
+        <w:numPr>
+          <w:ilvl w:val="1"/>
+          <w:numId w:val="4"/>
+        </w:numPr>
+      </w:pPr>
+      <w:proofErr w:type="spellStart"/>
+      <w:r>
+        <w:t>MainSummary</w:t>
+      </w:r>
+      <w:proofErr w:type="spellEnd"/>
+      <w:r>
+        <w:t xml:space="preserve"> tab show overview of main tourney finances.</w:t>
+      </w:r>
+    </w:p>
+    <w:p>
+      <w:pPr>
+        <w:pStyle w:val="ListParagraph"/>
+        <w:numPr>
+          <w:ilvl w:val="1"/>
+          <w:numId w:val="4"/>
+        </w:numPr>
+      </w:pPr>
+      <w:proofErr w:type="spellStart"/>
+      <w:r>
+        <w:t>PlayerBenefits</w:t>
+      </w:r>
+      <w:proofErr w:type="spellEnd"/>
+      <w:r>
+        <w:t xml:space="preserve"> tab captures costs for trophies, meals</w:t>
+      </w:r>
+      <w:proofErr w:type="gramStart"/>
+      <w:r>
+        <w:t>, drinks</w:t>
+      </w:r>
+      <w:proofErr w:type="gramEnd"/>
+      <w:r>
+        <w:t>.</w:t>
       </w:r>
     </w:p>
     <w:p>
@@ -495,7 +655,15 @@
       </w:pPr>
       <w:r>
         <w:lastRenderedPageBreak/>
-        <w:t>Expenses tab captures other expenses</w:t>
+        <w:t xml:space="preserve">Expenses </w:t>
+      </w:r>
+      <w:proofErr w:type="gramStart"/>
+      <w:r>
+        <w:t>tab captures</w:t>
+      </w:r>
+      <w:proofErr w:type="gramEnd"/>
+      <w:r>
+        <w:t xml:space="preserve"> other expenses</w:t>
       </w:r>
       <w:r>
         <w:t>.</w:t>
@@ -522,7 +690,23 @@
         </w:numPr>
       </w:pPr>
       <w:r>
-        <w:t xml:space="preserve">When all financials are marked complete, BracketPayOffs tab </w:t>
+        <w:t xml:space="preserve">When all financials are marked </w:t>
+      </w:r>
+      <w:proofErr w:type="gramStart"/>
+      <w:r>
+        <w:t>complete</w:t>
+      </w:r>
+      <w:proofErr w:type="gramEnd"/>
+      <w:r>
+        <w:t xml:space="preserve">, </w:t>
+      </w:r>
+      <w:proofErr w:type="spellStart"/>
+      <w:r>
+        <w:t>BracketPayOffs</w:t>
+      </w:r>
+      <w:proofErr w:type="spellEnd"/>
+      <w:r>
+        <w:t xml:space="preserve"> tab </w:t>
       </w:r>
       <w:r>
         <w:t>can be posted.</w:t>
@@ -536,8 +720,13 @@
           <w:numId w:val="4"/>
         </w:numPr>
       </w:pPr>
-      <w:r>
-        <w:t xml:space="preserve">PayOffSignOff tab contains signature sheet for </w:t>
+      <w:proofErr w:type="spellStart"/>
+      <w:r>
+        <w:t>PayOffSignOff</w:t>
+      </w:r>
+      <w:proofErr w:type="spellEnd"/>
+      <w:r>
+        <w:t xml:space="preserve"> tab contains signature sheet for </w:t>
       </w:r>
       <w:r>
         <w:t>play off brackets.</w:t>
@@ -551,21 +740,28 @@
           <w:numId w:val="4"/>
         </w:numPr>
       </w:pPr>
-      <w:r>
-        <w:t>CashInOut tab is a general scratch sheet for recording expenses, cash, change.</w:t>
-      </w:r>
-    </w:p>
-    <w:p>
-      <w:pPr>
-        <w:pStyle w:val="ListParagraph"/>
-        <w:numPr>
-          <w:ilvl w:val="0"/>
-          <w:numId w:val="4"/>
-        </w:numPr>
-      </w:pPr>
+      <w:proofErr w:type="spellStart"/>
+      <w:r>
+        <w:t>CashInOut</w:t>
+      </w:r>
+      <w:proofErr w:type="spellEnd"/>
+      <w:r>
+        <w:t xml:space="preserve"> tab is a general scratch sheet for recording expenses, cash, change.</w:t>
+      </w:r>
+    </w:p>
+    <w:p>
+      <w:pPr>
+        <w:pStyle w:val="ListParagraph"/>
+        <w:numPr>
+          <w:ilvl w:val="0"/>
+          <w:numId w:val="4"/>
+        </w:numPr>
+      </w:pPr>
+      <w:proofErr w:type="spellStart"/>
       <w:r>
         <w:t>MainSidePools</w:t>
       </w:r>
+      <w:proofErr w:type="spellEnd"/>
     </w:p>
     <w:p>
       <w:pPr>
@@ -600,55 +796,118 @@
         </w:numPr>
       </w:pPr>
       <w:r>
-        <w:t>The actual winners are in Pool1, 2, 3, 4 tabs from MainRoster when results are in.</w:t>
-      </w:r>
-    </w:p>
-    <w:p>
-      <w:pPr>
-        <w:pStyle w:val="ListParagraph"/>
-        <w:numPr>
-          <w:ilvl w:val="0"/>
-          <w:numId w:val="4"/>
-        </w:numPr>
-      </w:pPr>
+        <w:t xml:space="preserve">The actual winners are in Pool1, 2, 3, 4 tabs from </w:t>
+      </w:r>
+      <w:proofErr w:type="spellStart"/>
+      <w:r>
+        <w:t>MainRoster</w:t>
+      </w:r>
+      <w:proofErr w:type="spellEnd"/>
+      <w:r>
+        <w:t xml:space="preserve"> when results are in.</w:t>
+      </w:r>
+    </w:p>
+    <w:p>
+      <w:pPr>
+        <w:pStyle w:val="ListParagraph"/>
+        <w:numPr>
+          <w:ilvl w:val="0"/>
+          <w:numId w:val="4"/>
+        </w:numPr>
+      </w:pPr>
+      <w:proofErr w:type="spellStart"/>
       <w:r>
         <w:t>ConsyRoster</w:t>
       </w:r>
-    </w:p>
-    <w:p>
-      <w:pPr>
-        <w:pStyle w:val="ListParagraph"/>
-        <w:numPr>
-          <w:ilvl w:val="1"/>
-          <w:numId w:val="4"/>
-        </w:numPr>
-      </w:pPr>
-      <w:r>
-        <w:t>All players are copied from MainRoster to ConsyRoster.</w:t>
-      </w:r>
-    </w:p>
-    <w:p>
-      <w:pPr>
-        <w:pStyle w:val="ListParagraph"/>
-        <w:numPr>
-          <w:ilvl w:val="1"/>
-          <w:numId w:val="4"/>
-        </w:numPr>
-      </w:pPr>
-      <w:r>
-        <w:t>Plain labels are produced and printed from LabelList PlainLabels tab.</w:t>
-      </w:r>
-    </w:p>
-    <w:p>
-      <w:pPr>
-        <w:pStyle w:val="ListParagraph"/>
-        <w:numPr>
-          <w:ilvl w:val="1"/>
-          <w:numId w:val="4"/>
-        </w:numPr>
-      </w:pPr>
-      <w:r>
-        <w:t>ConsyCheckInSheet used to manually record players who enter the Consy Tourney.</w:t>
+      <w:proofErr w:type="spellEnd"/>
+    </w:p>
+    <w:p>
+      <w:pPr>
+        <w:pStyle w:val="ListParagraph"/>
+        <w:numPr>
+          <w:ilvl w:val="1"/>
+          <w:numId w:val="4"/>
+        </w:numPr>
+      </w:pPr>
+      <w:r>
+        <w:t xml:space="preserve">All players are copied from </w:t>
+      </w:r>
+      <w:proofErr w:type="spellStart"/>
+      <w:r>
+        <w:t>MainRoster</w:t>
+      </w:r>
+      <w:proofErr w:type="spellEnd"/>
+      <w:r>
+        <w:t xml:space="preserve"> to </w:t>
+      </w:r>
+      <w:proofErr w:type="spellStart"/>
+      <w:r>
+        <w:t>ConsyRoster</w:t>
+      </w:r>
+      <w:proofErr w:type="spellEnd"/>
+      <w:r>
+        <w:t>.</w:t>
+      </w:r>
+    </w:p>
+    <w:p>
+      <w:pPr>
+        <w:pStyle w:val="ListParagraph"/>
+        <w:numPr>
+          <w:ilvl w:val="1"/>
+          <w:numId w:val="4"/>
+        </w:numPr>
+      </w:pPr>
+      <w:r>
+        <w:t xml:space="preserve">Plain labels are produced and printed from </w:t>
+      </w:r>
+      <w:proofErr w:type="spellStart"/>
+      <w:r>
+        <w:t>LabelList</w:t>
+      </w:r>
+      <w:proofErr w:type="spellEnd"/>
+      <w:r>
+        <w:t xml:space="preserve"> </w:t>
+      </w:r>
+      <w:proofErr w:type="spellStart"/>
+      <w:r>
+        <w:t>PlainLabels</w:t>
+      </w:r>
+      <w:proofErr w:type="spellEnd"/>
+      <w:r>
+        <w:t xml:space="preserve"> tab.</w:t>
+      </w:r>
+    </w:p>
+    <w:p>
+      <w:pPr>
+        <w:pStyle w:val="ListParagraph"/>
+        <w:numPr>
+          <w:ilvl w:val="1"/>
+          <w:numId w:val="4"/>
+        </w:numPr>
+      </w:pPr>
+      <w:proofErr w:type="spellStart"/>
+      <w:r>
+        <w:t>ConsyCheckInSheet</w:t>
+      </w:r>
+      <w:proofErr w:type="spellEnd"/>
+      <w:r>
+        <w:t xml:space="preserve"> </w:t>
+      </w:r>
+      <w:proofErr w:type="gramStart"/>
+      <w:r>
+        <w:t>used</w:t>
+      </w:r>
+      <w:proofErr w:type="gramEnd"/>
+      <w:r>
+        <w:t xml:space="preserve"> to manually record players who enter the </w:t>
+      </w:r>
+      <w:proofErr w:type="spellStart"/>
+      <w:r>
+        <w:t>Consy</w:t>
+      </w:r>
+      <w:proofErr w:type="spellEnd"/>
+      <w:r>
+        <w:t xml:space="preserve"> Tourney.</w:t>
       </w:r>
     </w:p>
     <w:p>
@@ -674,11 +933,29 @@
       <w:r>
         <w:t xml:space="preserve">After </w:t>
       </w:r>
-      <w:r>
-        <w:t>end of play</w:t>
-      </w:r>
-      <w:r>
-        <w:t>, qualifiers are marked in Q’d column and moved to Results tab.</w:t>
+      <w:proofErr w:type="gramStart"/>
+      <w:r>
+        <w:t>end of</w:t>
+      </w:r>
+      <w:proofErr w:type="gramEnd"/>
+      <w:r>
+        <w:t xml:space="preserve"> </w:t>
+      </w:r>
+      <w:proofErr w:type="gramStart"/>
+      <w:r>
+        <w:t>play</w:t>
+      </w:r>
+      <w:proofErr w:type="gramEnd"/>
+      <w:r>
+        <w:t xml:space="preserve">, qualifiers are marked in </w:t>
+      </w:r>
+      <w:proofErr w:type="spellStart"/>
+      <w:r>
+        <w:t>Q’d</w:t>
+      </w:r>
+      <w:proofErr w:type="spellEnd"/>
+      <w:r>
+        <w:t xml:space="preserve"> column and moved to Results tab.</w:t>
       </w:r>
     </w:p>
     <w:p>
@@ -702,80 +979,141 @@
         </w:numPr>
       </w:pPr>
       <w:r>
-        <w:t>Pool payout sheets available once all players are know and qualification order is known.</w:t>
-      </w:r>
-    </w:p>
-    <w:p>
-      <w:pPr>
-        <w:pStyle w:val="ListParagraph"/>
-        <w:numPr>
-          <w:ilvl w:val="0"/>
-          <w:numId w:val="4"/>
-        </w:numPr>
-      </w:pPr>
+        <w:t xml:space="preserve">Pool payout sheets </w:t>
+      </w:r>
+      <w:proofErr w:type="gramStart"/>
+      <w:r>
+        <w:t>available</w:t>
+      </w:r>
+      <w:proofErr w:type="gramEnd"/>
+      <w:r>
+        <w:t xml:space="preserve"> once all players are </w:t>
+      </w:r>
+      <w:proofErr w:type="spellStart"/>
+      <w:proofErr w:type="gramStart"/>
+      <w:r>
+        <w:t>know</w:t>
+      </w:r>
+      <w:proofErr w:type="spellEnd"/>
+      <w:proofErr w:type="gramEnd"/>
+      <w:r>
+        <w:t xml:space="preserve"> and qualification order is known.</w:t>
+      </w:r>
+    </w:p>
+    <w:p>
+      <w:pPr>
+        <w:pStyle w:val="ListParagraph"/>
+        <w:numPr>
+          <w:ilvl w:val="0"/>
+          <w:numId w:val="4"/>
+        </w:numPr>
+      </w:pPr>
+      <w:proofErr w:type="spellStart"/>
       <w:r>
         <w:t>ConsyFinancials</w:t>
       </w:r>
-    </w:p>
-    <w:p>
-      <w:pPr>
-        <w:pStyle w:val="ListParagraph"/>
-        <w:numPr>
-          <w:ilvl w:val="1"/>
-          <w:numId w:val="4"/>
-        </w:numPr>
-      </w:pPr>
-      <w:r>
-        <w:t>ConsySummary tab shows overview of tourney finances.</w:t>
-      </w:r>
-    </w:p>
-    <w:p>
-      <w:pPr>
-        <w:pStyle w:val="ListParagraph"/>
-        <w:numPr>
-          <w:ilvl w:val="1"/>
-          <w:numId w:val="4"/>
-        </w:numPr>
-      </w:pPr>
-      <w:r>
-        <w:t>Expenses and PlayerBenefit tabs capture consy-specific expenses.</w:t>
-      </w:r>
-    </w:p>
-    <w:p>
-      <w:pPr>
-        <w:pStyle w:val="ListParagraph"/>
-        <w:numPr>
-          <w:ilvl w:val="1"/>
-          <w:numId w:val="4"/>
-        </w:numPr>
-      </w:pPr>
-      <w:r>
-        <w:t>BarcketPayOffs tab computed and printable once all expenses are in.</w:t>
-      </w:r>
-    </w:p>
-    <w:p>
-      <w:pPr>
-        <w:pStyle w:val="ListParagraph"/>
-        <w:numPr>
-          <w:ilvl w:val="1"/>
-          <w:numId w:val="4"/>
-        </w:numPr>
-      </w:pPr>
-      <w:r>
-        <w:t>PayOffSignOff tab printable once consy tourney has started.</w:t>
-      </w:r>
-    </w:p>
-    <w:p>
-      <w:pPr>
-        <w:pStyle w:val="ListParagraph"/>
-        <w:numPr>
-          <w:ilvl w:val="0"/>
-          <w:numId w:val="4"/>
-        </w:numPr>
-      </w:pPr>
+      <w:proofErr w:type="spellEnd"/>
+    </w:p>
+    <w:p>
+      <w:pPr>
+        <w:pStyle w:val="ListParagraph"/>
+        <w:numPr>
+          <w:ilvl w:val="1"/>
+          <w:numId w:val="4"/>
+        </w:numPr>
+      </w:pPr>
+      <w:proofErr w:type="spellStart"/>
+      <w:r>
+        <w:t>ConsySummary</w:t>
+      </w:r>
+      <w:proofErr w:type="spellEnd"/>
+      <w:r>
+        <w:t xml:space="preserve"> tab shows overview of tourney finances.</w:t>
+      </w:r>
+    </w:p>
+    <w:p>
+      <w:pPr>
+        <w:pStyle w:val="ListParagraph"/>
+        <w:numPr>
+          <w:ilvl w:val="1"/>
+          <w:numId w:val="4"/>
+        </w:numPr>
+      </w:pPr>
+      <w:r>
+        <w:t xml:space="preserve">Expenses and </w:t>
+      </w:r>
+      <w:proofErr w:type="spellStart"/>
+      <w:r>
+        <w:t>PlayerBenefit</w:t>
+      </w:r>
+      <w:proofErr w:type="spellEnd"/>
+      <w:r>
+        <w:t xml:space="preserve"> tabs capture </w:t>
+      </w:r>
+      <w:proofErr w:type="spellStart"/>
+      <w:r>
+        <w:t>consy</w:t>
+      </w:r>
+      <w:proofErr w:type="spellEnd"/>
+      <w:r>
+        <w:t>-specific expenses.</w:t>
+      </w:r>
+    </w:p>
+    <w:p>
+      <w:pPr>
+        <w:pStyle w:val="ListParagraph"/>
+        <w:numPr>
+          <w:ilvl w:val="1"/>
+          <w:numId w:val="4"/>
+        </w:numPr>
+      </w:pPr>
+      <w:proofErr w:type="spellStart"/>
+      <w:r>
+        <w:t>BarcketPayOffs</w:t>
+      </w:r>
+      <w:proofErr w:type="spellEnd"/>
+      <w:r>
+        <w:t xml:space="preserve"> tab computed and printable once all expenses are in.</w:t>
+      </w:r>
+    </w:p>
+    <w:p>
+      <w:pPr>
+        <w:pStyle w:val="ListParagraph"/>
+        <w:numPr>
+          <w:ilvl w:val="1"/>
+          <w:numId w:val="4"/>
+        </w:numPr>
+      </w:pPr>
+      <w:proofErr w:type="spellStart"/>
+      <w:r>
+        <w:t>PayOffSignOff</w:t>
+      </w:r>
+      <w:proofErr w:type="spellEnd"/>
+      <w:r>
+        <w:t xml:space="preserve"> tab printable once </w:t>
+      </w:r>
+      <w:proofErr w:type="spellStart"/>
+      <w:r>
+        <w:t>consy</w:t>
+      </w:r>
+      <w:proofErr w:type="spellEnd"/>
+      <w:r>
+        <w:t xml:space="preserve"> tourney has started.</w:t>
+      </w:r>
+    </w:p>
+    <w:p>
+      <w:pPr>
+        <w:pStyle w:val="ListParagraph"/>
+        <w:numPr>
+          <w:ilvl w:val="0"/>
+          <w:numId w:val="4"/>
+        </w:numPr>
+      </w:pPr>
+      <w:proofErr w:type="spellStart"/>
       <w:r>
         <w:t>ConsySidePools</w:t>
       </w:r>
+      <w:proofErr w:type="spellEnd"/>
     </w:p>
     <w:p>
       <w:pPr>
@@ -788,8 +1126,13 @@
       <w:r>
         <w:t xml:space="preserve">PrtPool1, 2, 3, 4 tabs have printable pay-off calculations as soon as </w:t>
       </w:r>
-      <w:r>
-        <w:t>Consy T</w:t>
+      <w:proofErr w:type="spellStart"/>
+      <w:r>
+        <w:t>Consy</w:t>
+      </w:r>
+      <w:proofErr w:type="spellEnd"/>
+      <w:r>
+        <w:t xml:space="preserve"> T</w:t>
       </w:r>
       <w:r>
         <w:t>ourney starts.</w:t>
@@ -804,7 +1147,15 @@
         </w:numPr>
       </w:pPr>
       <w:r>
-        <w:t>The actual winners are in Pool1, 2, 3, 4 tabs from ConsyRoster when results are in.</w:t>
+        <w:t xml:space="preserve">The actual winners are in Pool1, 2, 3, 4 tabs from </w:t>
+      </w:r>
+      <w:proofErr w:type="spellStart"/>
+      <w:r>
+        <w:t>ConsyRoster</w:t>
+      </w:r>
+      <w:proofErr w:type="spellEnd"/>
+      <w:r>
+        <w:t xml:space="preserve"> when results are in.</w:t>
       </w:r>
     </w:p>
     <w:p>
@@ -839,19 +1190,35 @@
         </w:numPr>
       </w:pPr>
       <w:r>
-        <w:t>Set up PreliminaryRegstration for new Tourney.</w:t>
-      </w:r>
-    </w:p>
-    <w:p>
-      <w:pPr>
-        <w:pStyle w:val="ListParagraph"/>
-        <w:numPr>
-          <w:ilvl w:val="1"/>
-          <w:numId w:val="5"/>
-        </w:numPr>
-      </w:pPr>
-      <w:r>
-        <w:t>Clear PreliminaryRegistration Entries tab</w:t>
+        <w:t xml:space="preserve">Set up </w:t>
+      </w:r>
+      <w:proofErr w:type="spellStart"/>
+      <w:r>
+        <w:t>PreliminaryRegstration</w:t>
+      </w:r>
+      <w:proofErr w:type="spellEnd"/>
+      <w:r>
+        <w:t xml:space="preserve"> for new Tourney.</w:t>
+      </w:r>
+    </w:p>
+    <w:p>
+      <w:pPr>
+        <w:pStyle w:val="ListParagraph"/>
+        <w:numPr>
+          <w:ilvl w:val="1"/>
+          <w:numId w:val="5"/>
+        </w:numPr>
+      </w:pPr>
+      <w:r>
+        <w:t xml:space="preserve">Clear </w:t>
+      </w:r>
+      <w:proofErr w:type="spellStart"/>
+      <w:r>
+        <w:t>PreliminaryRegistration</w:t>
+      </w:r>
+      <w:proofErr w:type="spellEnd"/>
+      <w:r>
+        <w:t xml:space="preserve"> Entries tab</w:t>
       </w:r>
       <w:r>
         <w:t xml:space="preserve"> with the clear button.</w:t>
@@ -866,7 +1233,15 @@
         </w:numPr>
       </w:pPr>
       <w:r>
-        <w:t>Ensure the PreliminaryRegistration Entries tab is no</w:t>
+        <w:t xml:space="preserve">Ensure the </w:t>
+      </w:r>
+      <w:proofErr w:type="spellStart"/>
+      <w:r>
+        <w:t>PreliminaryRegistration</w:t>
+      </w:r>
+      <w:proofErr w:type="spellEnd"/>
+      <w:r>
+        <w:t xml:space="preserve"> Entries tab is no</w:t>
       </w:r>
       <w:r>
         <w:t>t</w:t>
@@ -944,8 +1319,13 @@
         </w:numPr>
       </w:pPr>
       <w:r>
-        <w:t>Gather entries using PreliminaryRegistration</w:t>
-      </w:r>
+        <w:t xml:space="preserve">Gather entries using </w:t>
+      </w:r>
+      <w:proofErr w:type="spellStart"/>
+      <w:r>
+        <w:t>PreliminaryRegistration</w:t>
+      </w:r>
+      <w:proofErr w:type="spellEnd"/>
       <w:r>
         <w:t xml:space="preserve"> Entries tab.</w:t>
       </w:r>
@@ -971,19 +1351,35 @@
         </w:numPr>
       </w:pPr>
       <w:r>
-        <w:t>Check PreliminaryRegistration using the Validation button on the Entries sheet.</w:t>
-      </w:r>
-    </w:p>
-    <w:p>
-      <w:pPr>
-        <w:pStyle w:val="ListParagraph"/>
-        <w:numPr>
-          <w:ilvl w:val="1"/>
-          <w:numId w:val="5"/>
-        </w:numPr>
-      </w:pPr>
-      <w:r>
-        <w:t>Day before tourney, send PreliminaryRegistration to tourney statistician.</w:t>
+        <w:t xml:space="preserve">Check </w:t>
+      </w:r>
+      <w:proofErr w:type="spellStart"/>
+      <w:r>
+        <w:t>PreliminaryRegistration</w:t>
+      </w:r>
+      <w:proofErr w:type="spellEnd"/>
+      <w:r>
+        <w:t xml:space="preserve"> using the Validation button on the Entries sheet.</w:t>
+      </w:r>
+    </w:p>
+    <w:p>
+      <w:pPr>
+        <w:pStyle w:val="ListParagraph"/>
+        <w:numPr>
+          <w:ilvl w:val="1"/>
+          <w:numId w:val="5"/>
+        </w:numPr>
+      </w:pPr>
+      <w:r>
+        <w:t xml:space="preserve">Day before tourney, send </w:t>
+      </w:r>
+      <w:proofErr w:type="spellStart"/>
+      <w:r>
+        <w:t>PreliminaryRegistration</w:t>
+      </w:r>
+      <w:proofErr w:type="spellEnd"/>
+      <w:r>
+        <w:t xml:space="preserve"> to tourney statistician.</w:t>
       </w:r>
     </w:p>
     <w:p>
@@ -1013,7 +1409,15 @@
         </w:numPr>
       </w:pPr>
       <w:r>
-        <w:t>Statistician sorts PreliminaryRegistration and Registration</w:t>
+        <w:t xml:space="preserve">Statistician sorts </w:t>
+      </w:r>
+      <w:proofErr w:type="spellStart"/>
+      <w:r>
+        <w:t>PreliminaryRegistration</w:t>
+      </w:r>
+      <w:proofErr w:type="spellEnd"/>
+      <w:r>
+        <w:t xml:space="preserve"> and Registration</w:t>
       </w:r>
       <w:r>
         <w:t xml:space="preserve"> Entries tab</w:t>
@@ -1085,7 +1489,15 @@
         <w:t xml:space="preserve"> from Prelim</w:t>
       </w:r>
       <w:r>
-        <w:t xml:space="preserve"> to Registration Entries tab.</w:t>
+        <w:t xml:space="preserve"> to Registration Entries </w:t>
+      </w:r>
+      <w:proofErr w:type="gramStart"/>
+      <w:r>
+        <w:t>tab</w:t>
+      </w:r>
+      <w:proofErr w:type="gramEnd"/>
+      <w:r>
+        <w:t>.</w:t>
       </w:r>
     </w:p>
     <w:p>
@@ -1136,19 +1548,43 @@
         </w:numPr>
       </w:pPr>
       <w:r>
-        <w:t>Set up the consy parameters and pools at this time.</w:t>
-      </w:r>
-    </w:p>
-    <w:p>
-      <w:pPr>
-        <w:pStyle w:val="ListParagraph"/>
-        <w:numPr>
-          <w:ilvl w:val="1"/>
-          <w:numId w:val="5"/>
-        </w:numPr>
-      </w:pPr>
-      <w:r>
-        <w:t>Confirm Tourney, MainSetup, and ConsySetup tab input for accuracy and completeness.</w:t>
+        <w:t xml:space="preserve">Set up the </w:t>
+      </w:r>
+      <w:proofErr w:type="spellStart"/>
+      <w:r>
+        <w:t>consy</w:t>
+      </w:r>
+      <w:proofErr w:type="spellEnd"/>
+      <w:r>
+        <w:t xml:space="preserve"> parameters and pools at this time.</w:t>
+      </w:r>
+    </w:p>
+    <w:p>
+      <w:pPr>
+        <w:pStyle w:val="ListParagraph"/>
+        <w:numPr>
+          <w:ilvl w:val="1"/>
+          <w:numId w:val="5"/>
+        </w:numPr>
+      </w:pPr>
+      <w:r>
+        <w:t xml:space="preserve">Confirm Tourney, </w:t>
+      </w:r>
+      <w:proofErr w:type="spellStart"/>
+      <w:r>
+        <w:t>MainSetup</w:t>
+      </w:r>
+      <w:proofErr w:type="spellEnd"/>
+      <w:r>
+        <w:t xml:space="preserve">, and </w:t>
+      </w:r>
+      <w:proofErr w:type="spellStart"/>
+      <w:r>
+        <w:t>ConsySetup</w:t>
+      </w:r>
+      <w:proofErr w:type="spellEnd"/>
+      <w:r>
+        <w:t xml:space="preserve"> tab input for accuracy and completeness.</w:t>
       </w:r>
     </w:p>
     <w:p>
@@ -1190,19 +1626,35 @@
         </w:numPr>
       </w:pPr>
       <w:r>
-        <w:t>Use Sort buttons to complete Unpaid, Anchors, Veggies tabs for print out.</w:t>
-      </w:r>
-    </w:p>
-    <w:p>
-      <w:pPr>
-        <w:pStyle w:val="ListParagraph"/>
-        <w:numPr>
-          <w:ilvl w:val="1"/>
-          <w:numId w:val="5"/>
-        </w:numPr>
-      </w:pPr>
-      <w:r>
-        <w:t>When satisfied, use Move to Main to copy Registration to MainRoster workbook.</w:t>
+        <w:t xml:space="preserve">Use Sort buttons to complete Unpaid, Anchors, Veggies tabs for </w:t>
+      </w:r>
+      <w:proofErr w:type="gramStart"/>
+      <w:r>
+        <w:t>print</w:t>
+      </w:r>
+      <w:proofErr w:type="gramEnd"/>
+      <w:r>
+        <w:t xml:space="preserve"> out.</w:t>
+      </w:r>
+    </w:p>
+    <w:p>
+      <w:pPr>
+        <w:pStyle w:val="ListParagraph"/>
+        <w:numPr>
+          <w:ilvl w:val="1"/>
+          <w:numId w:val="5"/>
+        </w:numPr>
+      </w:pPr>
+      <w:r>
+        <w:t xml:space="preserve">When satisfied, use Move to Main to copy Registration to </w:t>
+      </w:r>
+      <w:proofErr w:type="spellStart"/>
+      <w:r>
+        <w:t>MainRoster</w:t>
+      </w:r>
+      <w:proofErr w:type="spellEnd"/>
+      <w:r>
+        <w:t xml:space="preserve"> workbook.</w:t>
       </w:r>
     </w:p>
     <w:p>
@@ -1231,8 +1683,13 @@
           <w:numId w:val="5"/>
         </w:numPr>
       </w:pPr>
-      <w:r>
-        <w:t>LabelList tab</w:t>
+      <w:proofErr w:type="spellStart"/>
+      <w:r>
+        <w:t>LabelList</w:t>
+      </w:r>
+      <w:proofErr w:type="spellEnd"/>
+      <w:r>
+        <w:t xml:space="preserve"> tab</w:t>
       </w:r>
       <w:r>
         <w:t>s</w:t>
@@ -1250,7 +1707,15 @@
         </w:numPr>
       </w:pPr>
       <w:r>
-        <w:t xml:space="preserve">Print PoolLabels tab for Main </w:t>
+        <w:t xml:space="preserve">Print </w:t>
+      </w:r>
+      <w:proofErr w:type="spellStart"/>
+      <w:r>
+        <w:t>PoolLabels</w:t>
+      </w:r>
+      <w:proofErr w:type="spellEnd"/>
+      <w:r>
+        <w:t xml:space="preserve"> tab for Main </w:t>
       </w:r>
       <w:r>
         <w:t>T</w:t>
@@ -1268,7 +1733,23 @@
         </w:numPr>
       </w:pPr>
       <w:r>
-        <w:t xml:space="preserve">Print PlainLabels tab for use on Consy </w:t>
+        <w:t xml:space="preserve">Print </w:t>
+      </w:r>
+      <w:proofErr w:type="spellStart"/>
+      <w:r>
+        <w:t>PlainLabels</w:t>
+      </w:r>
+      <w:proofErr w:type="spellEnd"/>
+      <w:r>
+        <w:t xml:space="preserve"> tab for use on </w:t>
+      </w:r>
+      <w:proofErr w:type="spellStart"/>
+      <w:r>
+        <w:t>Consy</w:t>
+      </w:r>
+      <w:proofErr w:type="spellEnd"/>
+      <w:r>
+        <w:t xml:space="preserve"> </w:t>
       </w:r>
       <w:r>
         <w:t>T</w:t>
@@ -1286,115 +1767,234 @@
         </w:numPr>
       </w:pPr>
       <w:r>
-        <w:t>Make sure any no-shows are removed from MainRoster Entries tab before tourney play starts.</w:t>
-      </w:r>
-    </w:p>
-    <w:p>
-      <w:pPr>
-        <w:pStyle w:val="ListParagraph"/>
-        <w:numPr>
-          <w:ilvl w:val="1"/>
-          <w:numId w:val="5"/>
-        </w:numPr>
-      </w:pPr>
-      <w:r>
-        <w:t>Use Open Workbooks to get all the required workbooks opened up ready to go.</w:t>
-      </w:r>
-    </w:p>
-    <w:p>
-      <w:pPr>
-        <w:pStyle w:val="ListParagraph"/>
-        <w:numPr>
-          <w:ilvl w:val="1"/>
-          <w:numId w:val="5"/>
-        </w:numPr>
-      </w:pPr>
-      <w:r>
-        <w:t>This final validation on the MainRoster sets the payout pools.</w:t>
-      </w:r>
-    </w:p>
-    <w:p>
-      <w:pPr>
-        <w:pStyle w:val="ListParagraph"/>
-        <w:numPr>
-          <w:ilvl w:val="1"/>
-          <w:numId w:val="5"/>
-        </w:numPr>
-      </w:pPr>
-      <w:r>
-        <w:t>Use Copy Main Roster Numbers to get MainRoster number for MainFinancials calculations</w:t>
-      </w:r>
-    </w:p>
-    <w:p>
-      <w:pPr>
-        <w:pStyle w:val="ListParagraph"/>
-        <w:numPr>
-          <w:ilvl w:val="1"/>
-          <w:numId w:val="5"/>
-        </w:numPr>
-      </w:pPr>
-      <w:r>
-        <w:t>Check MainFinancials and validate all expenses are in.</w:t>
-      </w:r>
-    </w:p>
-    <w:p>
-      <w:pPr>
-        <w:pStyle w:val="ListParagraph"/>
-        <w:numPr>
-          <w:ilvl w:val="1"/>
-          <w:numId w:val="5"/>
-        </w:numPr>
-      </w:pPr>
-      <w:r>
-        <w:t>Use FinalizePayOffs on MainSummary tab to compute all payoff bracket bracket amounts.</w:t>
-      </w:r>
-    </w:p>
-    <w:p>
-      <w:pPr>
-        <w:pStyle w:val="ListParagraph"/>
-        <w:numPr>
-          <w:ilvl w:val="1"/>
-          <w:numId w:val="5"/>
-        </w:numPr>
-      </w:pPr>
-      <w:r>
-        <w:t>Grad pools tables found on MainPools; pool1 is EQ pool so cannot yet be caluclated</w:t>
-      </w:r>
-    </w:p>
-    <w:p>
-      <w:pPr>
-        <w:pStyle w:val="ListParagraph"/>
-        <w:numPr>
-          <w:ilvl w:val="1"/>
-          <w:numId w:val="5"/>
-        </w:numPr>
-      </w:pPr>
-      <w:r>
-        <w:t>Use FinalizeForNoShows on MainRoster Entries tab to create all payoff brackets and tabs.</w:t>
-      </w:r>
-    </w:p>
-    <w:p>
-      <w:pPr>
-        <w:pStyle w:val="ListParagraph"/>
-        <w:numPr>
-          <w:ilvl w:val="1"/>
-          <w:numId w:val="5"/>
-        </w:numPr>
-      </w:pPr>
-      <w:r>
-        <w:t>BracketPayOffs tab in MainFinancials can now be printed.</w:t>
-      </w:r>
-    </w:p>
-    <w:p>
-      <w:pPr>
-        <w:pStyle w:val="ListParagraph"/>
-        <w:numPr>
-          <w:ilvl w:val="1"/>
-          <w:numId w:val="5"/>
-        </w:numPr>
-      </w:pPr>
-      <w:r>
-        <w:t>MainSidePools PrtPool1, 2, 3, 4 tabs have printable payoff amounts for main pools.</w:t>
+        <w:t xml:space="preserve">Make sure any no-shows are removed from </w:t>
+      </w:r>
+      <w:proofErr w:type="spellStart"/>
+      <w:r>
+        <w:t>MainRoster</w:t>
+      </w:r>
+      <w:proofErr w:type="spellEnd"/>
+      <w:r>
+        <w:t xml:space="preserve"> Entries tab before tourney play starts.</w:t>
+      </w:r>
+    </w:p>
+    <w:p>
+      <w:pPr>
+        <w:pStyle w:val="ListParagraph"/>
+        <w:numPr>
+          <w:ilvl w:val="1"/>
+          <w:numId w:val="5"/>
+        </w:numPr>
+      </w:pPr>
+      <w:r>
+        <w:t xml:space="preserve">Use Open Workbooks to get all the required workbooks </w:t>
+      </w:r>
+      <w:proofErr w:type="gramStart"/>
+      <w:r>
+        <w:t>opened up</w:t>
+      </w:r>
+      <w:proofErr w:type="gramEnd"/>
+      <w:r>
+        <w:t xml:space="preserve"> ready to go.</w:t>
+      </w:r>
+    </w:p>
+    <w:p>
+      <w:pPr>
+        <w:pStyle w:val="ListParagraph"/>
+        <w:numPr>
+          <w:ilvl w:val="1"/>
+          <w:numId w:val="5"/>
+        </w:numPr>
+      </w:pPr>
+      <w:r>
+        <w:t xml:space="preserve">This final validation on the </w:t>
+      </w:r>
+      <w:proofErr w:type="spellStart"/>
+      <w:r>
+        <w:t>MainRoster</w:t>
+      </w:r>
+      <w:proofErr w:type="spellEnd"/>
+      <w:r>
+        <w:t xml:space="preserve"> sets the payout pools.</w:t>
+      </w:r>
+    </w:p>
+    <w:p>
+      <w:pPr>
+        <w:pStyle w:val="ListParagraph"/>
+        <w:numPr>
+          <w:ilvl w:val="1"/>
+          <w:numId w:val="5"/>
+        </w:numPr>
+      </w:pPr>
+      <w:r>
+        <w:t xml:space="preserve">Use Copy Main Roster Numbers to get </w:t>
+      </w:r>
+      <w:proofErr w:type="spellStart"/>
+      <w:r>
+        <w:t>MainRoster</w:t>
+      </w:r>
+      <w:proofErr w:type="spellEnd"/>
+      <w:r>
+        <w:t xml:space="preserve"> number for </w:t>
+      </w:r>
+      <w:proofErr w:type="spellStart"/>
+      <w:r>
+        <w:t>MainFinancials</w:t>
+      </w:r>
+      <w:proofErr w:type="spellEnd"/>
+      <w:r>
+        <w:t xml:space="preserve"> calculations</w:t>
+      </w:r>
+    </w:p>
+    <w:p>
+      <w:pPr>
+        <w:pStyle w:val="ListParagraph"/>
+        <w:numPr>
+          <w:ilvl w:val="1"/>
+          <w:numId w:val="5"/>
+        </w:numPr>
+      </w:pPr>
+      <w:r>
+        <w:t xml:space="preserve">Check </w:t>
+      </w:r>
+      <w:proofErr w:type="spellStart"/>
+      <w:r>
+        <w:t>MainFinancials</w:t>
+      </w:r>
+      <w:proofErr w:type="spellEnd"/>
+      <w:r>
+        <w:t xml:space="preserve"> and validate all expenses are in.</w:t>
+      </w:r>
+    </w:p>
+    <w:p>
+      <w:pPr>
+        <w:pStyle w:val="ListParagraph"/>
+        <w:numPr>
+          <w:ilvl w:val="1"/>
+          <w:numId w:val="5"/>
+        </w:numPr>
+      </w:pPr>
+      <w:r>
+        <w:t xml:space="preserve">Use </w:t>
+      </w:r>
+      <w:proofErr w:type="spellStart"/>
+      <w:r>
+        <w:t>FinalizePayOffs</w:t>
+      </w:r>
+      <w:proofErr w:type="spellEnd"/>
+      <w:r>
+        <w:t xml:space="preserve"> on </w:t>
+      </w:r>
+      <w:proofErr w:type="spellStart"/>
+      <w:r>
+        <w:t>MainSummary</w:t>
+      </w:r>
+      <w:proofErr w:type="spellEnd"/>
+      <w:r>
+        <w:t xml:space="preserve"> tab to compute all payoff bracket </w:t>
+      </w:r>
+      <w:proofErr w:type="spellStart"/>
+      <w:r>
+        <w:t>bracket</w:t>
+      </w:r>
+      <w:proofErr w:type="spellEnd"/>
+      <w:r>
+        <w:t xml:space="preserve"> amounts.</w:t>
+      </w:r>
+    </w:p>
+    <w:p>
+      <w:pPr>
+        <w:pStyle w:val="ListParagraph"/>
+        <w:numPr>
+          <w:ilvl w:val="1"/>
+          <w:numId w:val="5"/>
+        </w:numPr>
+      </w:pPr>
+      <w:r>
+        <w:t xml:space="preserve">Grad pools tables found on </w:t>
+      </w:r>
+      <w:proofErr w:type="spellStart"/>
+      <w:r>
+        <w:t>MainPools</w:t>
+      </w:r>
+      <w:proofErr w:type="spellEnd"/>
+      <w:r>
+        <w:t xml:space="preserve">; pool1 is EQ pool so cannot yet be </w:t>
+      </w:r>
+      <w:proofErr w:type="spellStart"/>
+      <w:r>
+        <w:t>caluclated</w:t>
+      </w:r>
+      <w:proofErr w:type="spellEnd"/>
+    </w:p>
+    <w:p>
+      <w:pPr>
+        <w:pStyle w:val="ListParagraph"/>
+        <w:numPr>
+          <w:ilvl w:val="1"/>
+          <w:numId w:val="5"/>
+        </w:numPr>
+      </w:pPr>
+      <w:r>
+        <w:t xml:space="preserve">Use </w:t>
+      </w:r>
+      <w:proofErr w:type="spellStart"/>
+      <w:r>
+        <w:t>FinalizeForNoShows</w:t>
+      </w:r>
+      <w:proofErr w:type="spellEnd"/>
+      <w:r>
+        <w:t xml:space="preserve"> on </w:t>
+      </w:r>
+      <w:proofErr w:type="spellStart"/>
+      <w:r>
+        <w:t>MainRoster</w:t>
+      </w:r>
+      <w:proofErr w:type="spellEnd"/>
+      <w:r>
+        <w:t xml:space="preserve"> Entries tab to create all payoff brackets and tabs.</w:t>
+      </w:r>
+    </w:p>
+    <w:p>
+      <w:pPr>
+        <w:pStyle w:val="ListParagraph"/>
+        <w:numPr>
+          <w:ilvl w:val="1"/>
+          <w:numId w:val="5"/>
+        </w:numPr>
+      </w:pPr>
+      <w:proofErr w:type="spellStart"/>
+      <w:r>
+        <w:t>BracketPayOffs</w:t>
+      </w:r>
+      <w:proofErr w:type="spellEnd"/>
+      <w:r>
+        <w:t xml:space="preserve"> tab in </w:t>
+      </w:r>
+      <w:proofErr w:type="spellStart"/>
+      <w:r>
+        <w:t>MainFinancials</w:t>
+      </w:r>
+      <w:proofErr w:type="spellEnd"/>
+      <w:r>
+        <w:t xml:space="preserve"> can now be printed.</w:t>
+      </w:r>
+    </w:p>
+    <w:p>
+      <w:pPr>
+        <w:pStyle w:val="ListParagraph"/>
+        <w:numPr>
+          <w:ilvl w:val="1"/>
+          <w:numId w:val="5"/>
+        </w:numPr>
+      </w:pPr>
+      <w:proofErr w:type="spellStart"/>
+      <w:r>
+        <w:t>MainSidePools</w:t>
+      </w:r>
+      <w:proofErr w:type="spellEnd"/>
+      <w:r>
+        <w:t xml:space="preserve"> PrtPool1, 2, 3, 4 tabs have printable payoff amounts for main pools.</w:t>
       </w:r>
     </w:p>
     <w:p>
@@ -1419,7 +2019,15 @@
       </w:pPr>
       <w:r>
         <w:lastRenderedPageBreak/>
-        <w:t>Enter the game card results into MainRoster Results tab and sort</w:t>
+        <w:t xml:space="preserve">Enter the game card results into </w:t>
+      </w:r>
+      <w:proofErr w:type="spellStart"/>
+      <w:r>
+        <w:t>MainRoster</w:t>
+      </w:r>
+      <w:proofErr w:type="spellEnd"/>
+      <w:r>
+        <w:t xml:space="preserve"> Results tab and sort</w:t>
       </w:r>
       <w:r>
         <w:t xml:space="preserve"> for qualifying order.</w:t>
@@ -1434,19 +2042,37 @@
         </w:numPr>
       </w:pPr>
       <w:r>
-        <w:t>You must have entered the results before MainPools can be computed and MainSidePool.xlsm must already be open.</w:t>
-      </w:r>
-    </w:p>
-    <w:p>
-      <w:pPr>
-        <w:pStyle w:val="ListParagraph"/>
-        <w:numPr>
-          <w:ilvl w:val="1"/>
-          <w:numId w:val="5"/>
-        </w:numPr>
-      </w:pPr>
-      <w:r>
-        <w:t>ON MainRoster:Results, after Sort Main Results, Finalize Pools will put all the names into all the pools</w:t>
+        <w:t xml:space="preserve">You must have entered the results before </w:t>
+      </w:r>
+      <w:proofErr w:type="spellStart"/>
+      <w:r>
+        <w:t>MainPools</w:t>
+      </w:r>
+      <w:proofErr w:type="spellEnd"/>
+      <w:r>
+        <w:t xml:space="preserve"> can be computed and MainSidePool.xlsm must already be open.</w:t>
+      </w:r>
+    </w:p>
+    <w:p>
+      <w:pPr>
+        <w:pStyle w:val="ListParagraph"/>
+        <w:numPr>
+          <w:ilvl w:val="1"/>
+          <w:numId w:val="5"/>
+        </w:numPr>
+      </w:pPr>
+      <w:r>
+        <w:t xml:space="preserve">ON </w:t>
+      </w:r>
+      <w:proofErr w:type="spellStart"/>
+      <w:proofErr w:type="gramStart"/>
+      <w:r>
+        <w:t>MainRoster:Results</w:t>
+      </w:r>
+      <w:proofErr w:type="spellEnd"/>
+      <w:proofErr w:type="gramEnd"/>
+      <w:r>
+        <w:t>, after Sort Main Results, Finalize Pools will put all the names into all the pools</w:t>
       </w:r>
     </w:p>
     <w:p>
@@ -1482,49 +2108,91 @@
         </w:numPr>
       </w:pPr>
       <w:r>
-        <w:t>As play-offs progress, record in Playoff Place which bracket they qualify for.</w:t>
-      </w:r>
-    </w:p>
-    <w:p>
-      <w:pPr>
-        <w:pStyle w:val="ListParagraph"/>
-        <w:numPr>
-          <w:ilvl w:val="1"/>
-          <w:numId w:val="5"/>
-        </w:numPr>
-      </w:pPr>
-      <w:r>
-        <w:t>Use PayOffSignOff tab printout to have play-off players sign for their pay-off.</w:t>
-      </w:r>
-    </w:p>
-    <w:p>
-      <w:pPr>
-        <w:pStyle w:val="ListParagraph"/>
-        <w:numPr>
-          <w:ilvl w:val="0"/>
-          <w:numId w:val="5"/>
-        </w:numPr>
-      </w:pPr>
-      <w:r>
-        <w:t>Use ConsyRoster to manage ConsyTourney</w:t>
-      </w:r>
-    </w:p>
-    <w:p>
-      <w:pPr>
-        <w:pStyle w:val="ListParagraph"/>
-        <w:numPr>
-          <w:ilvl w:val="1"/>
-          <w:numId w:val="5"/>
-        </w:numPr>
-      </w:pPr>
-      <w:r>
-        <w:t xml:space="preserve">Print ConsyCheckInSheet tab to use for manual </w:t>
-      </w:r>
+        <w:t xml:space="preserve">As play-offs progress, record in Playoff Place </w:t>
+      </w:r>
+      <w:proofErr w:type="gramStart"/>
+      <w:r>
+        <w:t>which</w:t>
+      </w:r>
+      <w:proofErr w:type="gramEnd"/>
+      <w:r>
+        <w:t xml:space="preserve"> bracket they qualify for.</w:t>
+      </w:r>
+    </w:p>
+    <w:p>
+      <w:pPr>
+        <w:pStyle w:val="ListParagraph"/>
+        <w:numPr>
+          <w:ilvl w:val="1"/>
+          <w:numId w:val="5"/>
+        </w:numPr>
+      </w:pPr>
+      <w:r>
+        <w:t xml:space="preserve">Use </w:t>
+      </w:r>
+      <w:proofErr w:type="spellStart"/>
+      <w:r>
+        <w:t>PayOffSignOff</w:t>
+      </w:r>
+      <w:proofErr w:type="spellEnd"/>
+      <w:r>
+        <w:t xml:space="preserve"> tab printout to have play-off players sign for their pay-off.</w:t>
+      </w:r>
+    </w:p>
+    <w:p>
+      <w:pPr>
+        <w:pStyle w:val="ListParagraph"/>
+        <w:numPr>
+          <w:ilvl w:val="0"/>
+          <w:numId w:val="5"/>
+        </w:numPr>
+      </w:pPr>
+      <w:r>
+        <w:t xml:space="preserve">Use </w:t>
+      </w:r>
+      <w:proofErr w:type="spellStart"/>
+      <w:r>
+        <w:t>ConsyRoster</w:t>
+      </w:r>
+      <w:proofErr w:type="spellEnd"/>
+      <w:r>
+        <w:t xml:space="preserve"> to manage </w:t>
+      </w:r>
+      <w:proofErr w:type="spellStart"/>
+      <w:r>
+        <w:t>ConsyTourney</w:t>
+      </w:r>
+      <w:proofErr w:type="spellEnd"/>
+    </w:p>
+    <w:p>
+      <w:pPr>
+        <w:pStyle w:val="ListParagraph"/>
+        <w:numPr>
+          <w:ilvl w:val="1"/>
+          <w:numId w:val="5"/>
+        </w:numPr>
+      </w:pPr>
+      <w:r>
+        <w:t xml:space="preserve">Print </w:t>
+      </w:r>
+      <w:proofErr w:type="spellStart"/>
+      <w:r>
+        <w:t>ConsyCheckInSheet</w:t>
+      </w:r>
+      <w:proofErr w:type="spellEnd"/>
+      <w:r>
+        <w:t xml:space="preserve"> tab to use for manual </w:t>
+      </w:r>
+      <w:proofErr w:type="spellStart"/>
       <w:r>
         <w:t>C</w:t>
       </w:r>
       <w:r>
-        <w:t xml:space="preserve">onsy </w:t>
+        <w:t>onsy</w:t>
+      </w:r>
+      <w:proofErr w:type="spellEnd"/>
+      <w:r>
+        <w:t xml:space="preserve"> </w:t>
       </w:r>
       <w:r>
         <w:t>tourney entries and pools.</w:t>
@@ -1539,43 +2207,99 @@
         </w:numPr>
       </w:pPr>
       <w:r>
-        <w:t>Use PlainLabels from 2.7 to put consy players on game card.</w:t>
-      </w:r>
-    </w:p>
-    <w:p>
-      <w:pPr>
-        <w:pStyle w:val="ListParagraph"/>
-        <w:numPr>
-          <w:ilvl w:val="1"/>
-          <w:numId w:val="5"/>
-        </w:numPr>
-      </w:pPr>
-      <w:r>
-        <w:t>Manually mark Consy Tourney cards with pools entered.</w:t>
-      </w:r>
-    </w:p>
-    <w:p>
-      <w:pPr>
-        <w:pStyle w:val="ListParagraph"/>
-        <w:numPr>
-          <w:ilvl w:val="1"/>
-          <w:numId w:val="5"/>
-        </w:numPr>
-      </w:pPr>
-      <w:r>
-        <w:t>Enter Consy entrants and pools using Entries tab in ConsyRoster workbook.</w:t>
-      </w:r>
-    </w:p>
-    <w:p>
-      <w:pPr>
-        <w:pStyle w:val="ListParagraph"/>
-        <w:numPr>
-          <w:ilvl w:val="1"/>
-          <w:numId w:val="5"/>
-        </w:numPr>
-      </w:pPr>
-      <w:r>
-        <w:t>Check ConsyFinancials to finalize any Consy-specific expenses – usually player benefits.</w:t>
+        <w:t xml:space="preserve">Use </w:t>
+      </w:r>
+      <w:proofErr w:type="spellStart"/>
+      <w:r>
+        <w:t>PlainLabels</w:t>
+      </w:r>
+      <w:proofErr w:type="spellEnd"/>
+      <w:r>
+        <w:t xml:space="preserve"> from 2.7 to put </w:t>
+      </w:r>
+      <w:proofErr w:type="spellStart"/>
+      <w:r>
+        <w:t>consy</w:t>
+      </w:r>
+      <w:proofErr w:type="spellEnd"/>
+      <w:r>
+        <w:t xml:space="preserve"> players on game card.</w:t>
+      </w:r>
+    </w:p>
+    <w:p>
+      <w:pPr>
+        <w:pStyle w:val="ListParagraph"/>
+        <w:numPr>
+          <w:ilvl w:val="1"/>
+          <w:numId w:val="5"/>
+        </w:numPr>
+      </w:pPr>
+      <w:r>
+        <w:t xml:space="preserve">Manually mark </w:t>
+      </w:r>
+      <w:proofErr w:type="spellStart"/>
+      <w:r>
+        <w:t>Consy</w:t>
+      </w:r>
+      <w:proofErr w:type="spellEnd"/>
+      <w:r>
+        <w:t xml:space="preserve"> Tourney cards with pools entered.</w:t>
+      </w:r>
+    </w:p>
+    <w:p>
+      <w:pPr>
+        <w:pStyle w:val="ListParagraph"/>
+        <w:numPr>
+          <w:ilvl w:val="1"/>
+          <w:numId w:val="5"/>
+        </w:numPr>
+      </w:pPr>
+      <w:r>
+        <w:t xml:space="preserve">Enter </w:t>
+      </w:r>
+      <w:proofErr w:type="spellStart"/>
+      <w:r>
+        <w:t>Consy</w:t>
+      </w:r>
+      <w:proofErr w:type="spellEnd"/>
+      <w:r>
+        <w:t xml:space="preserve"> entrants and pools using Entries tab in </w:t>
+      </w:r>
+      <w:proofErr w:type="spellStart"/>
+      <w:r>
+        <w:t>ConsyRoster</w:t>
+      </w:r>
+      <w:proofErr w:type="spellEnd"/>
+      <w:r>
+        <w:t xml:space="preserve"> workbook.</w:t>
+      </w:r>
+    </w:p>
+    <w:p>
+      <w:pPr>
+        <w:pStyle w:val="ListParagraph"/>
+        <w:numPr>
+          <w:ilvl w:val="1"/>
+          <w:numId w:val="5"/>
+        </w:numPr>
+      </w:pPr>
+      <w:r>
+        <w:t xml:space="preserve">Check </w:t>
+      </w:r>
+      <w:proofErr w:type="spellStart"/>
+      <w:r>
+        <w:t>ConsyFinancials</w:t>
+      </w:r>
+      <w:proofErr w:type="spellEnd"/>
+      <w:r>
+        <w:t xml:space="preserve"> to finalize any </w:t>
+      </w:r>
+      <w:proofErr w:type="spellStart"/>
+      <w:r>
+        <w:t>Consy</w:t>
+      </w:r>
+      <w:proofErr w:type="spellEnd"/>
+      <w:r>
+        <w:t>-specific expenses – usually player benefits.</w:t>
       </w:r>
     </w:p>
     <w:p>
@@ -1593,31 +2317,105 @@
         <w:t>9</w:t>
       </w:r>
       <w:r>
-        <w:t xml:space="preserve"> above but using Consy-specific workbooks and tabs.</w:t>
-      </w:r>
-    </w:p>
-    <w:p>
-      <w:pPr>
-        <w:pStyle w:val="ListParagraph"/>
-        <w:numPr>
-          <w:ilvl w:val="1"/>
-          <w:numId w:val="5"/>
-        </w:numPr>
-      </w:pPr>
-      <w:r>
-        <w:t xml:space="preserve">After recording all Entered on Consy:Entries sheet, Finalize Consy Entrants will create the Consy payoff schedule and the Consy Side Pools. </w:t>
-      </w:r>
-    </w:p>
-    <w:p>
-      <w:pPr>
-        <w:pStyle w:val="ListParagraph"/>
-        <w:numPr>
-          <w:ilvl w:val="1"/>
-          <w:numId w:val="5"/>
-        </w:numPr>
-      </w:pPr>
-      <w:r>
-        <w:t>Any Consy financial have to be recorded and Finalized before doing this computataion.</w:t>
+        <w:t xml:space="preserve"> above but using </w:t>
+      </w:r>
+      <w:proofErr w:type="spellStart"/>
+      <w:r>
+        <w:t>Consy</w:t>
+      </w:r>
+      <w:proofErr w:type="spellEnd"/>
+      <w:r>
+        <w:t>-specific workbooks and tabs.</w:t>
+      </w:r>
+    </w:p>
+    <w:p>
+      <w:pPr>
+        <w:pStyle w:val="ListParagraph"/>
+        <w:numPr>
+          <w:ilvl w:val="1"/>
+          <w:numId w:val="5"/>
+        </w:numPr>
+      </w:pPr>
+      <w:r>
+        <w:t xml:space="preserve">After recording all Entered on </w:t>
+      </w:r>
+      <w:proofErr w:type="spellStart"/>
+      <w:proofErr w:type="gramStart"/>
+      <w:r>
+        <w:t>Consy:Entries</w:t>
+      </w:r>
+      <w:proofErr w:type="spellEnd"/>
+      <w:proofErr w:type="gramEnd"/>
+      <w:r>
+        <w:t xml:space="preserve"> sheet, Finalize </w:t>
+      </w:r>
+      <w:proofErr w:type="spellStart"/>
+      <w:r>
+        <w:t>Consy</w:t>
+      </w:r>
+      <w:proofErr w:type="spellEnd"/>
+      <w:r>
+        <w:t xml:space="preserve"> Entrants will create the </w:t>
+      </w:r>
+      <w:proofErr w:type="spellStart"/>
+      <w:r>
+        <w:t>Consy</w:t>
+      </w:r>
+      <w:proofErr w:type="spellEnd"/>
+      <w:r>
+        <w:t xml:space="preserve"> payoff schedule and the </w:t>
+      </w:r>
+      <w:proofErr w:type="spellStart"/>
+      <w:r>
+        <w:t>Consy</w:t>
+      </w:r>
+      <w:proofErr w:type="spellEnd"/>
+      <w:r>
+        <w:t xml:space="preserve"> Side Pools. </w:t>
+      </w:r>
+    </w:p>
+    <w:p>
+      <w:pPr>
+        <w:pStyle w:val="ListParagraph"/>
+        <w:numPr>
+          <w:ilvl w:val="1"/>
+          <w:numId w:val="5"/>
+        </w:numPr>
+      </w:pPr>
+      <w:r>
+        <w:t xml:space="preserve">Any </w:t>
+      </w:r>
+      <w:proofErr w:type="spellStart"/>
+      <w:r>
+        <w:t>Consy</w:t>
+      </w:r>
+      <w:proofErr w:type="spellEnd"/>
+      <w:r>
+        <w:t xml:space="preserve"> financial </w:t>
+      </w:r>
+      <w:proofErr w:type="gramStart"/>
+      <w:r>
+        <w:t>have to</w:t>
+      </w:r>
+      <w:proofErr w:type="gramEnd"/>
+      <w:r>
+        <w:t xml:space="preserve"> be recorded and </w:t>
+      </w:r>
+      <w:proofErr w:type="gramStart"/>
+      <w:r>
+        <w:t>Finalized</w:t>
+      </w:r>
+      <w:proofErr w:type="gramEnd"/>
+      <w:r>
+        <w:t xml:space="preserve"> before doing this </w:t>
+      </w:r>
+      <w:proofErr w:type="spellStart"/>
+      <w:r>
+        <w:t>computataion</w:t>
+      </w:r>
+      <w:proofErr w:type="spellEnd"/>
+      <w:r>
+        <w:t>.</w:t>
       </w:r>
     </w:p>
     <w:p/>
@@ -1664,7 +2462,15 @@
         </w:numPr>
       </w:pPr>
       <w:r>
-        <w:t>Excel settings must permit macros to be executed.</w:t>
+        <w:t xml:space="preserve">Excel settings must permit </w:t>
+      </w:r>
+      <w:proofErr w:type="gramStart"/>
+      <w:r>
+        <w:t>macros</w:t>
+      </w:r>
+      <w:proofErr w:type="gramEnd"/>
+      <w:r>
+        <w:t xml:space="preserve"> to be executed.</w:t>
       </w:r>
     </w:p>
     <w:p>
@@ -1752,7 +2558,15 @@
         <w:t xml:space="preserve">Most </w:t>
       </w:r>
       <w:r>
-        <w:t>workbooks are .xlsm to allow execution of macros.</w:t>
+        <w:t>workbooks are .</w:t>
+      </w:r>
+      <w:proofErr w:type="spellStart"/>
+      <w:r>
+        <w:t>xlsm</w:t>
+      </w:r>
+      <w:proofErr w:type="spellEnd"/>
+      <w:r>
+        <w:t xml:space="preserve"> to allow execution of macros.</w:t>
       </w:r>
     </w:p>
     <w:p>
@@ -1791,7 +2605,23 @@
         <w:t>classes defined</w:t>
       </w:r>
       <w:r>
-        <w:t xml:space="preserve"> in TourneyGlobalObjects which is part of the TourneyGlobalObjects project</w:t>
+        <w:t xml:space="preserve"> in </w:t>
+      </w:r>
+      <w:proofErr w:type="spellStart"/>
+      <w:r>
+        <w:t>TourneyGlobalObjects</w:t>
+      </w:r>
+      <w:proofErr w:type="spellEnd"/>
+      <w:r>
+        <w:t xml:space="preserve"> which is part of the </w:t>
+      </w:r>
+      <w:proofErr w:type="spellStart"/>
+      <w:r>
+        <w:t>TourneyGlobalObjects</w:t>
+      </w:r>
+      <w:proofErr w:type="spellEnd"/>
+      <w:r>
+        <w:t xml:space="preserve"> project</w:t>
       </w:r>
       <w:r>
         <w:t xml:space="preserve"> and implemented as singletons.</w:t>
@@ -1812,7 +2642,15 @@
         <w:t xml:space="preserve">other </w:t>
       </w:r>
       <w:r>
-        <w:t>workbooks are part of a separate TourneyProject Excel project.</w:t>
+        <w:t xml:space="preserve">workbooks are part of a separate </w:t>
+      </w:r>
+      <w:proofErr w:type="spellStart"/>
+      <w:r>
+        <w:t>TourneyProject</w:t>
+      </w:r>
+      <w:proofErr w:type="spellEnd"/>
+      <w:r>
+        <w:t xml:space="preserve"> Excel project.</w:t>
       </w:r>
     </w:p>
     <w:p>
@@ -1824,7 +2662,15 @@
         </w:numPr>
       </w:pPr>
       <w:r>
-        <w:t>Opening the Registration workbook automatically opens the TourneyGlobalObjects.</w:t>
+        <w:t xml:space="preserve">Opening the Registration workbook automatically opens the </w:t>
+      </w:r>
+      <w:proofErr w:type="spellStart"/>
+      <w:r>
+        <w:t>TourneyGlobalObjects</w:t>
+      </w:r>
+      <w:proofErr w:type="spellEnd"/>
+      <w:r>
+        <w:t>.</w:t>
       </w:r>
     </w:p>
     <w:p>
@@ -1836,7 +2682,15 @@
         </w:numPr>
       </w:pPr>
       <w:r>
-        <w:t>All objects are created and accessed using Public scope via cross-project Run requests.</w:t>
+        <w:t xml:space="preserve">All objects are created and accessed using </w:t>
+      </w:r>
+      <w:proofErr w:type="gramStart"/>
+      <w:r>
+        <w:t>Public</w:t>
+      </w:r>
+      <w:proofErr w:type="gramEnd"/>
+      <w:r>
+        <w:t xml:space="preserve"> scope via cross-project Run requests.</w:t>
       </w:r>
     </w:p>
     <w:p>
@@ -1884,7 +2738,15 @@
         </w:numPr>
       </w:pPr>
       <w:r>
-        <w:t>All fields of interest have a workbook-scoped name e.g. FRegEntriesEntryCount, FRegEntriesPool1</w:t>
+        <w:t xml:space="preserve">All fields of interest have a workbook-scoped name e.g. </w:t>
+      </w:r>
+      <w:proofErr w:type="spellStart"/>
+      <w:r>
+        <w:t>FRegEntriesEntryCount</w:t>
+      </w:r>
+      <w:proofErr w:type="spellEnd"/>
+      <w:r>
+        <w:t>, FRegEntriesPool1</w:t>
       </w:r>
       <w:r>
         <w:t>Fee</w:t>
@@ -1908,7 +2770,15 @@
         </w:numPr>
       </w:pPr>
       <w:r>
-        <w:t>VBA macros use the form &lt;fieldname&gt;.offset(row, col) to locate information</w:t>
+        <w:t>VBA macros use the form &lt;fieldname</w:t>
+      </w:r>
+      <w:proofErr w:type="gramStart"/>
+      <w:r>
+        <w:t>&gt;.offset</w:t>
+      </w:r>
+      <w:proofErr w:type="gramEnd"/>
+      <w:r>
+        <w:t>(row, col) to locate information</w:t>
       </w:r>
       <w:r>
         <w:t xml:space="preserve"> on worksheets.</w:t>
@@ -1922,8 +2792,21 @@
           <w:numId w:val="2"/>
         </w:numPr>
       </w:pPr>
-      <w:r>
-        <w:t>Example; FRegEntriesEnteredHdr.offset(1,0) locates first entry field in Entries worksheet of Registration workbook. Absolute row/column references are not used.</w:t>
+      <w:proofErr w:type="gramStart"/>
+      <w:r>
+        <w:t>Example;</w:t>
+      </w:r>
+      <w:proofErr w:type="gramEnd"/>
+      <w:r>
+        <w:t xml:space="preserve"> </w:t>
+      </w:r>
+      <w:proofErr w:type="spellStart"/>
+      <w:r>
+        <w:t>FRegEntriesEnteredHdr.offset</w:t>
+      </w:r>
+      <w:proofErr w:type="spellEnd"/>
+      <w:r>
+        <w:t>(1,0) locates first entry field in Entries worksheet of Registration workbook. Absolute row/column references are not used.</w:t>
       </w:r>
     </w:p>
     <w:p>
@@ -1938,7 +2821,17 @@
         <w:t xml:space="preserve">The class instance is saved </w:t>
       </w:r>
       <w:r>
-        <w:t xml:space="preserve">to it’s JSON file </w:t>
+        <w:t xml:space="preserve">to </w:t>
+      </w:r>
+      <w:proofErr w:type="spellStart"/>
+      <w:proofErr w:type="gramStart"/>
+      <w:r>
+        <w:t>it’s</w:t>
+      </w:r>
+      <w:proofErr w:type="spellEnd"/>
+      <w:proofErr w:type="gramEnd"/>
+      <w:r>
+        <w:t xml:space="preserve"> JSON file </w:t>
       </w:r>
       <w:r>
         <w:t>whenever any change is made to a class instance.</w:t>
@@ -1992,7 +2885,23 @@
         </w:numPr>
       </w:pPr>
       <w:r>
-        <w:t>Examples of common info. are Tourney Name, Location, Date, MainPool specs, ConsyPool specs.</w:t>
+        <w:t xml:space="preserve">Examples of common info. are Tourney Name, Location, Date, </w:t>
+      </w:r>
+      <w:proofErr w:type="spellStart"/>
+      <w:r>
+        <w:t>MainPool</w:t>
+      </w:r>
+      <w:proofErr w:type="spellEnd"/>
+      <w:r>
+        <w:t xml:space="preserve"> specs, </w:t>
+      </w:r>
+      <w:proofErr w:type="spellStart"/>
+      <w:r>
+        <w:t>ConsyPool</w:t>
+      </w:r>
+      <w:proofErr w:type="spellEnd"/>
+      <w:r>
+        <w:t xml:space="preserve"> specs.</w:t>
       </w:r>
     </w:p>
     <w:p>
@@ -2004,7 +2913,15 @@
         </w:numPr>
       </w:pPr>
       <w:r>
-        <w:t xml:space="preserve">Other examples are MainFinancials </w:t>
+        <w:t xml:space="preserve">Other examples are </w:t>
+      </w:r>
+      <w:proofErr w:type="spellStart"/>
+      <w:r>
+        <w:t>MainFinancials</w:t>
+      </w:r>
+      <w:proofErr w:type="spellEnd"/>
+      <w:r>
+        <w:t xml:space="preserve"> </w:t>
       </w:r>
       <w:r>
         <w:t xml:space="preserve">which </w:t>
@@ -2142,7 +3059,15 @@
         <w:t>,</w:t>
       </w:r>
       <w:r>
-        <w:t xml:space="preserve"> worksheet is unprotected to allow changes and then immediately protected again via VBA macros.</w:t>
+        <w:t xml:space="preserve"> </w:t>
+      </w:r>
+      <w:proofErr w:type="gramStart"/>
+      <w:r>
+        <w:t>worksheet is</w:t>
+      </w:r>
+      <w:proofErr w:type="gramEnd"/>
+      <w:r>
+        <w:t xml:space="preserve"> unprotected to allow changes and then immediately protected again via VBA macros.</w:t>
       </w:r>
     </w:p>
     <w:p>
@@ -2154,7 +3079,23 @@
         </w:numPr>
       </w:pPr>
       <w:r>
-        <w:t>Registration, MainRoster, and ConsyRoster allow user input/change in the main body</w:t>
+        <w:t xml:space="preserve">Registration, </w:t>
+      </w:r>
+      <w:proofErr w:type="spellStart"/>
+      <w:r>
+        <w:t>MainRoster</w:t>
+      </w:r>
+      <w:proofErr w:type="spellEnd"/>
+      <w:r>
+        <w:t xml:space="preserve">, and </w:t>
+      </w:r>
+      <w:proofErr w:type="spellStart"/>
+      <w:r>
+        <w:t>ConsyRoster</w:t>
+      </w:r>
+      <w:proofErr w:type="spellEnd"/>
+      <w:r>
+        <w:t xml:space="preserve"> allow user input/change in the main body</w:t>
       </w:r>
     </w:p>
     <w:p>
@@ -2169,7 +3110,15 @@
         <w:t>Registration</w:t>
       </w:r>
       <w:r>
-        <w:t xml:space="preserve"> is manually finalized for no-shows/pools before moving entrants to MainRoster.</w:t>
+        <w:t xml:space="preserve"> is manually finalized for no-shows/pools before moving entrants to </w:t>
+      </w:r>
+      <w:proofErr w:type="spellStart"/>
+      <w:r>
+        <w:t>MainRoster</w:t>
+      </w:r>
+      <w:proofErr w:type="spellEnd"/>
+      <w:r>
+        <w:t>.</w:t>
       </w:r>
     </w:p>
     <w:p>
@@ -2180,8 +3129,13 @@
           <w:numId w:val="2"/>
         </w:numPr>
       </w:pPr>
-      <w:r>
-        <w:t>MainRoster is filled in from Registration when the tourney starts.</w:t>
+      <w:proofErr w:type="spellStart"/>
+      <w:r>
+        <w:t>MainRoster</w:t>
+      </w:r>
+      <w:proofErr w:type="spellEnd"/>
+      <w:r>
+        <w:t xml:space="preserve"> is filled in from Registration when the tourney starts.</w:t>
       </w:r>
     </w:p>
     <w:p>
@@ -2192,12 +3146,22 @@
           <w:numId w:val="2"/>
         </w:numPr>
       </w:pPr>
-      <w:r>
-        <w:t xml:space="preserve">ConsyRoster is filled in </w:t>
-      </w:r>
-      <w:r>
-        <w:t>from the MainRoster</w:t>
-      </w:r>
+      <w:proofErr w:type="spellStart"/>
+      <w:r>
+        <w:t>ConsyRoster</w:t>
+      </w:r>
+      <w:proofErr w:type="spellEnd"/>
+      <w:r>
+        <w:t xml:space="preserve"> is filled in </w:t>
+      </w:r>
+      <w:r>
+        <w:t xml:space="preserve">from the </w:t>
+      </w:r>
+      <w:proofErr w:type="spellStart"/>
+      <w:r>
+        <w:t>MainRoster</w:t>
+      </w:r>
+      <w:proofErr w:type="spellEnd"/>
       <w:r>
         <w:t>– and adjusted for those that sign up.</w:t>
       </w:r>
@@ -2260,7 +3224,15 @@
         </w:numPr>
       </w:pPr>
       <w:r>
-        <w:t>Users may replace this with their own sidepool calculation workbook.</w:t>
+        <w:t xml:space="preserve">Users may replace this with their own </w:t>
+      </w:r>
+      <w:proofErr w:type="spellStart"/>
+      <w:r>
+        <w:t>sidepool</w:t>
+      </w:r>
+      <w:proofErr w:type="spellEnd"/>
+      <w:r>
+        <w:t xml:space="preserve"> calculation workbook.</w:t>
       </w:r>
     </w:p>
     <w:p>
@@ -2274,12 +3246,14 @@
       <w:r>
         <w:t xml:space="preserve">Replacement would </w:t>
       </w:r>
+      <w:proofErr w:type="gramStart"/>
       <w:r>
         <w:t>require</w:t>
       </w:r>
       <w:r>
         <w:t xml:space="preserve"> that</w:t>
       </w:r>
+      <w:proofErr w:type="gramEnd"/>
       <w:r>
         <w:t xml:space="preserve"> the</w:t>
       </w:r>
@@ -2296,7 +3270,15 @@
         </w:numPr>
       </w:pPr>
       <w:r>
-        <w:t>Main and consy payouts are computed dynamically and rounded to $5</w:t>
+        <w:t xml:space="preserve">Main and </w:t>
+      </w:r>
+      <w:proofErr w:type="spellStart"/>
+      <w:r>
+        <w:t>consy</w:t>
+      </w:r>
+      <w:proofErr w:type="spellEnd"/>
+      <w:r>
+        <w:t xml:space="preserve"> payouts are computed dynamically and rounded to $5</w:t>
       </w:r>
       <w:r>
         <w:t xml:space="preserve"> and allow manual adjustment.</w:t>
@@ -2311,7 +3293,15 @@
         </w:numPr>
       </w:pPr>
       <w:r>
-        <w:t>A separate PreliminaryRegistration workbook is used to capture early registrations.</w:t>
+        <w:t xml:space="preserve">A separate </w:t>
+      </w:r>
+      <w:proofErr w:type="spellStart"/>
+      <w:r>
+        <w:t>PreliminaryRegistration</w:t>
+      </w:r>
+      <w:proofErr w:type="spellEnd"/>
+      <w:r>
+        <w:t xml:space="preserve"> workbook is used to capture early registrations.</w:t>
       </w:r>
     </w:p>
     <w:p>
@@ -2323,7 +3313,15 @@
         </w:numPr>
       </w:pPr>
       <w:r>
-        <w:t>The contents of PreliminaryRegstration are value-copied to Registration for the Tourney.</w:t>
+        <w:t xml:space="preserve">The contents of </w:t>
+      </w:r>
+      <w:proofErr w:type="spellStart"/>
+      <w:r>
+        <w:t>PreliminaryRegstration</w:t>
+      </w:r>
+      <w:proofErr w:type="spellEnd"/>
+      <w:r>
+        <w:t xml:space="preserve"> are value-copied to Registration for the Tourney.</w:t>
       </w:r>
     </w:p>
     <w:p>
@@ -2335,13 +3333,29 @@
         </w:numPr>
       </w:pPr>
       <w:r>
-        <w:t>This is accomplished using Ctl+Alt+V the</w:t>
+        <w:t xml:space="preserve">This is accomplished using </w:t>
+      </w:r>
+      <w:proofErr w:type="spellStart"/>
+      <w:r>
+        <w:t>Ctl+Alt+V</w:t>
+      </w:r>
+      <w:proofErr w:type="spellEnd"/>
+      <w:r>
+        <w:t xml:space="preserve"> the</w:t>
       </w:r>
       <w:r>
         <w:t>n</w:t>
       </w:r>
       <w:r>
-        <w:t xml:space="preserve"> V+Enter paste</w:t>
+        <w:t xml:space="preserve"> </w:t>
+      </w:r>
+      <w:proofErr w:type="spellStart"/>
+      <w:r>
+        <w:t>V+Enter</w:t>
+      </w:r>
+      <w:proofErr w:type="spellEnd"/>
+      <w:r>
+        <w:t xml:space="preserve"> paste</w:t>
       </w:r>
       <w:r>
         <w:t>-</w:t>
@@ -2359,7 +3373,23 @@
         </w:numPr>
       </w:pPr>
       <w:r>
-        <w:t>Validation routines are used to ensure MainPool and ConsyPool specifications are valid.</w:t>
+        <w:t xml:space="preserve">Validation routines are used to ensure </w:t>
+      </w:r>
+      <w:proofErr w:type="spellStart"/>
+      <w:r>
+        <w:t>MainPool</w:t>
+      </w:r>
+      <w:proofErr w:type="spellEnd"/>
+      <w:r>
+        <w:t xml:space="preserve"> and </w:t>
+      </w:r>
+      <w:proofErr w:type="spellStart"/>
+      <w:r>
+        <w:t>ConsyPool</w:t>
+      </w:r>
+      <w:proofErr w:type="spellEnd"/>
+      <w:r>
+        <w:t xml:space="preserve"> specifications are valid.</w:t>
       </w:r>
     </w:p>
     <w:p>
@@ -2371,7 +3401,15 @@
         </w:numPr>
       </w:pPr>
       <w:r>
-        <w:t>When sheet content is modified or sorted, it is UnProtected to permit modification.</w:t>
+        <w:t xml:space="preserve">When sheet content is modified or sorted, it is </w:t>
+      </w:r>
+      <w:proofErr w:type="spellStart"/>
+      <w:r>
+        <w:t>UnProtected</w:t>
+      </w:r>
+      <w:proofErr w:type="spellEnd"/>
+      <w:r>
+        <w:t xml:space="preserve"> to permit modification.</w:t>
       </w:r>
     </w:p>
     <w:p>
@@ -2383,7 +3421,25 @@
         </w:numPr>
       </w:pPr>
       <w:r>
-        <w:t>Every sheet has a ResetSheet method where it takes care of clearing it’s own contents.</w:t>
+        <w:t xml:space="preserve">Every sheet has a </w:t>
+      </w:r>
+      <w:proofErr w:type="spellStart"/>
+      <w:r>
+        <w:t>ResetSheet</w:t>
+      </w:r>
+      <w:proofErr w:type="spellEnd"/>
+      <w:r>
+        <w:t xml:space="preserve"> method where it takes care of clearing </w:t>
+      </w:r>
+      <w:proofErr w:type="spellStart"/>
+      <w:proofErr w:type="gramStart"/>
+      <w:r>
+        <w:t>it’s</w:t>
+      </w:r>
+      <w:proofErr w:type="spellEnd"/>
+      <w:proofErr w:type="gramEnd"/>
+      <w:r>
+        <w:t xml:space="preserve"> own contents.</w:t>
       </w:r>
     </w:p>
     <w:p>
@@ -2395,7 +3451,15 @@
         </w:numPr>
       </w:pPr>
       <w:r>
-        <w:t>App clear functions call the ResetSheet for each of the worksheets in each workbook.</w:t>
+        <w:t xml:space="preserve">App clear functions call the </w:t>
+      </w:r>
+      <w:proofErr w:type="spellStart"/>
+      <w:r>
+        <w:t>ResetSheet</w:t>
+      </w:r>
+      <w:proofErr w:type="spellEnd"/>
+      <w:r>
+        <w:t xml:space="preserve"> for each of the worksheets in each workbook.</w:t>
       </w:r>
     </w:p>
     <w:p>
@@ -2431,7 +3495,15 @@
         </w:numPr>
       </w:pPr>
       <w:r>
-        <w:t>Screen updating is turned off when lots of workbooks are being opened of closed.</w:t>
+        <w:t xml:space="preserve">Screen updating is turned off when lots of workbooks are being opened </w:t>
+      </w:r>
+      <w:proofErr w:type="gramStart"/>
+      <w:r>
+        <w:t>of</w:t>
+      </w:r>
+      <w:proofErr w:type="gramEnd"/>
+      <w:r>
+        <w:t xml:space="preserve"> closed.</w:t>
       </w:r>
     </w:p>
     <w:p>
@@ -2451,7 +3523,31 @@
     <w:p/>
     <w:p>
       <w:r>
-        <w:t>Compilation conditionals are set by a right click on the ProjectTitle then set one or more conditionals using cond1 = 1 : cond2 = 1: cond3 = 1 :. . . etc.</w:t>
+        <w:t xml:space="preserve">Compilation conditionals are set by a right click on the </w:t>
+      </w:r>
+      <w:proofErr w:type="spellStart"/>
+      <w:r>
+        <w:t>ProjectTitle</w:t>
+      </w:r>
+      <w:proofErr w:type="spellEnd"/>
+      <w:r>
+        <w:t xml:space="preserve"> then set one or more conditionals using cond1 = </w:t>
+      </w:r>
+      <w:proofErr w:type="gramStart"/>
+      <w:r>
+        <w:t>1 :</w:t>
+      </w:r>
+      <w:proofErr w:type="gramEnd"/>
+      <w:r>
+        <w:t xml:space="preserve"> cond2 = 1: cond3 = </w:t>
+      </w:r>
+      <w:proofErr w:type="gramStart"/>
+      <w:r>
+        <w:t>1 :</w:t>
+      </w:r>
+      <w:proofErr w:type="gramEnd"/>
+      <w:r>
+        <w:t>. . . etc.</w:t>
       </w:r>
     </w:p>
     <w:p>
@@ -2461,13 +3557,28 @@
     </w:p>
     <w:p>
       <w:r>
-        <w:t>#If cond1 And cond2 then</w:t>
+        <w:t xml:space="preserve">#If cond1 </w:t>
+      </w:r>
+      <w:proofErr w:type="gramStart"/>
+      <w:r>
+        <w:t>And</w:t>
+      </w:r>
+      <w:proofErr w:type="gramEnd"/>
+      <w:r>
+        <w:t xml:space="preserve"> cond2 then</w:t>
       </w:r>
     </w:p>
     <w:p>
       <w:r>
         <w:tab/>
-        <w:t>Debug.print “cond2 traces”</w:t>
+      </w:r>
+      <w:proofErr w:type="spellStart"/>
+      <w:r>
+        <w:t>Debug.print</w:t>
+      </w:r>
+      <w:proofErr w:type="spellEnd"/>
+      <w:r>
+        <w:t xml:space="preserve"> “cond2 traces”</w:t>
       </w:r>
     </w:p>
     <w:p>
@@ -2479,9 +3590,11 @@
       <w:pPr>
         <w:pStyle w:val="Heading2"/>
       </w:pPr>
+      <w:proofErr w:type="spellStart"/>
       <w:r>
         <w:t>TourneyGlobalObjects</w:t>
       </w:r>
+      <w:proofErr w:type="spellEnd"/>
     </w:p>
     <w:p/>
     <w:p>
@@ -2492,15 +3605,25 @@
           <w:numId w:val="6"/>
         </w:numPr>
       </w:pPr>
+      <w:proofErr w:type="spellStart"/>
       <w:r>
         <w:t>debugMode</w:t>
       </w:r>
+      <w:proofErr w:type="spellEnd"/>
       <w:r>
         <w:tab/>
-        <w:t>All other conditionals are ANDed with debugMod</w:t>
-      </w:r>
-      <w:r>
-        <w:t>e—it’s the mast switch</w:t>
+        <w:t xml:space="preserve">All other conditionals are ANDed with </w:t>
+      </w:r>
+      <w:proofErr w:type="spellStart"/>
+      <w:r>
+        <w:t>debugMod</w:t>
+      </w:r>
+      <w:r>
+        <w:t>e</w:t>
+      </w:r>
+      <w:proofErr w:type="spellEnd"/>
+      <w:r>
+        <w:t>—it’s the mast switch</w:t>
       </w:r>
     </w:p>
     <w:p>
@@ -2511,9 +3634,11 @@
           <w:numId w:val="6"/>
         </w:numPr>
       </w:pPr>
+      <w:proofErr w:type="spellStart"/>
       <w:r>
         <w:t>tytrace</w:t>
       </w:r>
+      <w:proofErr w:type="spellEnd"/>
       <w:r>
         <w:tab/>
       </w:r>
@@ -2530,9 +3655,11 @@
           <w:numId w:val="6"/>
         </w:numPr>
       </w:pPr>
+      <w:proofErr w:type="spellStart"/>
       <w:r>
         <w:t>mftrace</w:t>
       </w:r>
+      <w:proofErr w:type="spellEnd"/>
       <w:r>
         <w:tab/>
       </w:r>
@@ -2549,15 +3676,25 @@
           <w:numId w:val="6"/>
         </w:numPr>
       </w:pPr>
+      <w:proofErr w:type="spellStart"/>
       <w:r>
         <w:t>cftrace</w:t>
       </w:r>
+      <w:proofErr w:type="spellEnd"/>
       <w:r>
         <w:tab/>
       </w:r>
       <w:r>
         <w:tab/>
-        <w:t>Trace consy financials class</w:t>
+        <w:t xml:space="preserve">Trace </w:t>
+      </w:r>
+      <w:proofErr w:type="spellStart"/>
+      <w:r>
+        <w:t>consy</w:t>
+      </w:r>
+      <w:proofErr w:type="spellEnd"/>
+      <w:r>
+        <w:t xml:space="preserve"> financials class</w:t>
       </w:r>
     </w:p>
     <w:p>
@@ -2568,9 +3705,11 @@
           <w:numId w:val="6"/>
         </w:numPr>
       </w:pPr>
+      <w:proofErr w:type="spellStart"/>
       <w:r>
         <w:t>mrtrace</w:t>
       </w:r>
+      <w:proofErr w:type="spellEnd"/>
       <w:r>
         <w:tab/>
       </w:r>
@@ -2587,15 +3726,25 @@
           <w:numId w:val="6"/>
         </w:numPr>
       </w:pPr>
+      <w:proofErr w:type="spellStart"/>
       <w:r>
         <w:t>crtrace</w:t>
       </w:r>
+      <w:proofErr w:type="spellEnd"/>
       <w:r>
         <w:tab/>
       </w:r>
       <w:r>
         <w:tab/>
-        <w:t>Trace consy roster class</w:t>
+        <w:t xml:space="preserve">Trace </w:t>
+      </w:r>
+      <w:proofErr w:type="spellStart"/>
+      <w:r>
+        <w:t>consy</w:t>
+      </w:r>
+      <w:proofErr w:type="spellEnd"/>
+      <w:r>
+        <w:t xml:space="preserve"> roster class</w:t>
       </w:r>
     </w:p>
     <w:p>
@@ -2606,9 +3755,11 @@
           <w:numId w:val="6"/>
         </w:numPr>
       </w:pPr>
+      <w:proofErr w:type="spellStart"/>
       <w:r>
         <w:t>mptrace</w:t>
       </w:r>
+      <w:proofErr w:type="spellEnd"/>
       <w:r>
         <w:tab/>
         <w:t>Trace main pool class</w:t>
@@ -2622,15 +3773,25 @@
           <w:numId w:val="6"/>
         </w:numPr>
       </w:pPr>
+      <w:proofErr w:type="spellStart"/>
       <w:r>
         <w:t>cptrace</w:t>
       </w:r>
+      <w:proofErr w:type="spellEnd"/>
       <w:r>
         <w:tab/>
       </w:r>
       <w:r>
         <w:tab/>
-        <w:t>Trace consy pool class</w:t>
+        <w:t xml:space="preserve">Trace </w:t>
+      </w:r>
+      <w:proofErr w:type="spellStart"/>
+      <w:r>
+        <w:t>consy</w:t>
+      </w:r>
+      <w:proofErr w:type="spellEnd"/>
+      <w:r>
+        <w:t xml:space="preserve"> pool class</w:t>
       </w:r>
     </w:p>
     <w:p>
@@ -2641,9 +3802,11 @@
           <w:numId w:val="6"/>
         </w:numPr>
       </w:pPr>
+      <w:proofErr w:type="spellStart"/>
       <w:r>
         <w:t>ptrace</w:t>
       </w:r>
+      <w:proofErr w:type="spellEnd"/>
       <w:r>
         <w:tab/>
       </w:r>
@@ -2660,9 +3823,11 @@
           <w:numId w:val="6"/>
         </w:numPr>
       </w:pPr>
+      <w:proofErr w:type="spellStart"/>
       <w:r>
         <w:t>regtrace</w:t>
       </w:r>
+      <w:proofErr w:type="spellEnd"/>
       <w:r>
         <w:tab/>
         <w:t>Trace registration class</w:t>
@@ -2676,9 +3841,11 @@
           <w:numId w:val="6"/>
         </w:numPr>
       </w:pPr>
+      <w:proofErr w:type="spellStart"/>
       <w:r>
         <w:t>mstrace</w:t>
       </w:r>
+      <w:proofErr w:type="spellEnd"/>
       <w:r>
         <w:tab/>
         <w:t>Trace main setup class</w:t>
@@ -2692,24 +3859,36 @@
           <w:numId w:val="6"/>
         </w:numPr>
       </w:pPr>
+      <w:proofErr w:type="spellStart"/>
       <w:r>
         <w:t>cstrace</w:t>
       </w:r>
+      <w:proofErr w:type="spellEnd"/>
       <w:r>
         <w:tab/>
       </w:r>
       <w:r>
         <w:tab/>
-        <w:t>Trace consy setup class</w:t>
+        <w:t xml:space="preserve">Trace </w:t>
+      </w:r>
+      <w:proofErr w:type="spellStart"/>
+      <w:r>
+        <w:t>consy</w:t>
+      </w:r>
+      <w:proofErr w:type="spellEnd"/>
+      <w:r>
+        <w:t xml:space="preserve"> setup class</w:t>
       </w:r>
     </w:p>
     <w:p>
       <w:pPr>
         <w:pStyle w:val="Heading2"/>
       </w:pPr>
+      <w:proofErr w:type="spellStart"/>
       <w:r>
         <w:t>TourneyProject</w:t>
       </w:r>
+      <w:proofErr w:type="spellEnd"/>
     </w:p>
     <w:p/>
     <w:p>
@@ -2720,12 +3899,22 @@
           <w:numId w:val="7"/>
         </w:numPr>
       </w:pPr>
+      <w:proofErr w:type="spellStart"/>
       <w:r>
         <w:t>debugMode</w:t>
       </w:r>
+      <w:proofErr w:type="spellEnd"/>
       <w:r>
         <w:tab/>
-        <w:t>All other conditionals are ANDed with debugMode—it’s the master switch</w:t>
+        <w:t xml:space="preserve">All other conditionals are ANDed with </w:t>
+      </w:r>
+      <w:proofErr w:type="spellStart"/>
+      <w:r>
+        <w:t>debugMode</w:t>
+      </w:r>
+      <w:proofErr w:type="spellEnd"/>
+      <w:r>
+        <w:t>—it’s the master switch</w:t>
       </w:r>
     </w:p>
     <w:p>
@@ -2736,9 +3925,11 @@
           <w:numId w:val="7"/>
         </w:numPr>
       </w:pPr>
+      <w:proofErr w:type="spellStart"/>
       <w:r>
         <w:t>classtrace</w:t>
       </w:r>
+      <w:proofErr w:type="spellEnd"/>
       <w:r>
         <w:tab/>
         <w:t xml:space="preserve">Generic trace classes </w:t>

</xml_diff>